<commit_message>
docs: clarify estimated weekly costs and preserve raw amounts
</commit_message>
<xml_diff>
--- a/tuan_2/docs/Bao_cao_Tuan_2_24110054_24110051.docx
+++ b/tuan_2/docs/Bao_cao_Tuan_2_24110054_24110051.docx
@@ -551,7 +551,7 @@
         </w:rPr>
         <w:fldChar w:fldCharType="separate"/>
       </w:r>
-      <w:hyperlink w:anchor="_Toc242892816" w:history="1">
+      <w:hyperlink w:anchor="_Toc242904384" w:history="1">
         <w:r>
           <w:rPr>
             <w:rStyle w:val="Hyperlink"/>
@@ -578,7 +578,7 @@
             <w:noProof/>
             <w:webHidden/>
           </w:rPr>
-          <w:instrText xml:space="preserve"> PAGEREF _Toc242892816 \h </w:instrText>
+          <w:instrText xml:space="preserve"> PAGEREF _Toc242904384 \h </w:instrText>
         </w:r>
         <w:r>
           <w:rPr>
@@ -625,7 +625,7 @@
           <w14:ligatures w14:val="standardContextual"/>
         </w:rPr>
       </w:pPr>
-      <w:hyperlink w:anchor="_Toc242892817" w:history="1">
+      <w:hyperlink w:anchor="_Toc242904385" w:history="1">
         <w:r>
           <w:rPr>
             <w:rStyle w:val="Hyperlink"/>
@@ -652,7 +652,7 @@
             <w:noProof/>
             <w:webHidden/>
           </w:rPr>
-          <w:instrText xml:space="preserve"> PAGEREF _Toc242892817 \h </w:instrText>
+          <w:instrText xml:space="preserve"> PAGEREF _Toc242904385 \h </w:instrText>
         </w:r>
         <w:r>
           <w:rPr>
@@ -699,7 +699,7 @@
           <w14:ligatures w14:val="standardContextual"/>
         </w:rPr>
       </w:pPr>
-      <w:hyperlink w:anchor="_Toc242892818" w:history="1">
+      <w:hyperlink w:anchor="_Toc242904386" w:history="1">
         <w:r>
           <w:rPr>
             <w:rStyle w:val="Hyperlink"/>
@@ -726,7 +726,7 @@
             <w:noProof/>
             <w:webHidden/>
           </w:rPr>
-          <w:instrText xml:space="preserve"> PAGEREF _Toc242892818 \h </w:instrText>
+          <w:instrText xml:space="preserve"> PAGEREF _Toc242904386 \h </w:instrText>
         </w:r>
         <w:r>
           <w:rPr>
@@ -773,7 +773,7 @@
           <w14:ligatures w14:val="standardContextual"/>
         </w:rPr>
       </w:pPr>
-      <w:hyperlink w:anchor="_Toc242892819" w:history="1">
+      <w:hyperlink w:anchor="_Toc242904387" w:history="1">
         <w:r>
           <w:rPr>
             <w:rStyle w:val="Hyperlink"/>
@@ -800,7 +800,7 @@
             <w:noProof/>
             <w:webHidden/>
           </w:rPr>
-          <w:instrText xml:space="preserve"> PAGEREF _Toc242892819 \h </w:instrText>
+          <w:instrText xml:space="preserve"> PAGEREF _Toc242904387 \h </w:instrText>
         </w:r>
         <w:r>
           <w:rPr>
@@ -847,7 +847,7 @@
           <w14:ligatures w14:val="standardContextual"/>
         </w:rPr>
       </w:pPr>
-      <w:hyperlink w:anchor="_Toc242892820" w:history="1">
+      <w:hyperlink w:anchor="_Toc242904388" w:history="1">
         <w:r>
           <w:rPr>
             <w:rStyle w:val="Hyperlink"/>
@@ -874,7 +874,7 @@
             <w:noProof/>
             <w:webHidden/>
           </w:rPr>
-          <w:instrText xml:space="preserve"> PAGEREF _Toc242892820 \h </w:instrText>
+          <w:instrText xml:space="preserve"> PAGEREF _Toc242904388 \h </w:instrText>
         </w:r>
         <w:r>
           <w:rPr>
@@ -922,7 +922,7 @@
           <w14:ligatures w14:val="standardContextual"/>
         </w:rPr>
       </w:pPr>
-      <w:hyperlink w:anchor="_Toc242892821" w:history="1">
+      <w:hyperlink w:anchor="_Toc242904389" w:history="1">
         <w:r>
           <w:rPr>
             <w:rStyle w:val="Hyperlink"/>
@@ -949,7 +949,7 @@
             <w:noProof/>
             <w:webHidden/>
           </w:rPr>
-          <w:instrText xml:space="preserve"> PAGEREF _Toc242892821 \h </w:instrText>
+          <w:instrText xml:space="preserve"> PAGEREF _Toc242904389 \h </w:instrText>
         </w:r>
         <w:r>
           <w:rPr>
@@ -996,7 +996,7 @@
           <w14:ligatures w14:val="standardContextual"/>
         </w:rPr>
       </w:pPr>
-      <w:hyperlink w:anchor="_Toc242892822" w:history="1">
+      <w:hyperlink w:anchor="_Toc242904390" w:history="1">
         <w:r>
           <w:rPr>
             <w:rStyle w:val="Hyperlink"/>
@@ -1023,7 +1023,7 @@
             <w:noProof/>
             <w:webHidden/>
           </w:rPr>
-          <w:instrText xml:space="preserve"> PAGEREF _Toc242892822 \h </w:instrText>
+          <w:instrText xml:space="preserve"> PAGEREF _Toc242904390 \h </w:instrText>
         </w:r>
         <w:r>
           <w:rPr>
@@ -1070,7 +1070,7 @@
           <w14:ligatures w14:val="standardContextual"/>
         </w:rPr>
       </w:pPr>
-      <w:hyperlink w:anchor="_Toc242892823" w:history="1">
+      <w:hyperlink w:anchor="_Toc242904391" w:history="1">
         <w:r>
           <w:rPr>
             <w:rStyle w:val="Hyperlink"/>
@@ -1097,7 +1097,7 @@
             <w:noProof/>
             <w:webHidden/>
           </w:rPr>
-          <w:instrText xml:space="preserve"> PAGEREF _Toc242892823 \h </w:instrText>
+          <w:instrText xml:space="preserve"> PAGEREF _Toc242904391 \h </w:instrText>
         </w:r>
         <w:r>
           <w:rPr>
@@ -1144,7 +1144,7 @@
           <w14:ligatures w14:val="standardContextual"/>
         </w:rPr>
       </w:pPr>
-      <w:hyperlink w:anchor="_Toc242892824" w:history="1">
+      <w:hyperlink w:anchor="_Toc242904392" w:history="1">
         <w:r>
           <w:rPr>
             <w:rStyle w:val="Hyperlink"/>
@@ -1171,7 +1171,7 @@
             <w:noProof/>
             <w:webHidden/>
           </w:rPr>
-          <w:instrText xml:space="preserve"> PAGEREF _Toc242892824 \h </w:instrText>
+          <w:instrText xml:space="preserve"> PAGEREF _Toc242904392 \h </w:instrText>
         </w:r>
         <w:r>
           <w:rPr>
@@ -1218,7 +1218,7 @@
           <w14:ligatures w14:val="standardContextual"/>
         </w:rPr>
       </w:pPr>
-      <w:hyperlink w:anchor="_Toc242892825" w:history="1">
+      <w:hyperlink w:anchor="_Toc242904393" w:history="1">
         <w:r>
           <w:rPr>
             <w:rStyle w:val="Hyperlink"/>
@@ -1245,7 +1245,7 @@
             <w:noProof/>
             <w:webHidden/>
           </w:rPr>
-          <w:instrText xml:space="preserve"> PAGEREF _Toc242892825 \h </w:instrText>
+          <w:instrText xml:space="preserve"> PAGEREF _Toc242904393 \h </w:instrText>
         </w:r>
         <w:r>
           <w:rPr>
@@ -1292,7 +1292,7 @@
           <w14:ligatures w14:val="standardContextual"/>
         </w:rPr>
       </w:pPr>
-      <w:hyperlink w:anchor="_Toc242892826" w:history="1">
+      <w:hyperlink w:anchor="_Toc242904394" w:history="1">
         <w:r>
           <w:rPr>
             <w:rStyle w:val="Hyperlink"/>
@@ -1319,7 +1319,7 @@
             <w:noProof/>
             <w:webHidden/>
           </w:rPr>
-          <w:instrText xml:space="preserve"> PAGEREF _Toc242892826 \h </w:instrText>
+          <w:instrText xml:space="preserve"> PAGEREF _Toc242904394 \h </w:instrText>
         </w:r>
         <w:r>
           <w:rPr>
@@ -1366,7 +1366,7 @@
           <w14:ligatures w14:val="standardContextual"/>
         </w:rPr>
       </w:pPr>
-      <w:hyperlink w:anchor="_Toc242892827" w:history="1">
+      <w:hyperlink w:anchor="_Toc242904395" w:history="1">
         <w:r>
           <w:rPr>
             <w:rStyle w:val="Hyperlink"/>
@@ -1393,7 +1393,7 @@
             <w:noProof/>
             <w:webHidden/>
           </w:rPr>
-          <w:instrText xml:space="preserve"> PAGEREF _Toc242892827 \h </w:instrText>
+          <w:instrText xml:space="preserve"> PAGEREF _Toc242904395 \h </w:instrText>
         </w:r>
         <w:r>
           <w:rPr>
@@ -1440,7 +1440,7 @@
           <w14:ligatures w14:val="standardContextual"/>
         </w:rPr>
       </w:pPr>
-      <w:hyperlink w:anchor="_Toc242892828" w:history="1">
+      <w:hyperlink w:anchor="_Toc242904396" w:history="1">
         <w:r>
           <w:rPr>
             <w:rStyle w:val="Hyperlink"/>
@@ -1467,7 +1467,7 @@
             <w:noProof/>
             <w:webHidden/>
           </w:rPr>
-          <w:instrText xml:space="preserve"> PAGEREF _Toc242892828 \h </w:instrText>
+          <w:instrText xml:space="preserve"> PAGEREF _Toc242904396 \h </w:instrText>
         </w:r>
         <w:r>
           <w:rPr>
@@ -1515,7 +1515,7 @@
           <w14:ligatures w14:val="standardContextual"/>
         </w:rPr>
       </w:pPr>
-      <w:hyperlink w:anchor="_Toc242892829" w:history="1">
+      <w:hyperlink w:anchor="_Toc242904397" w:history="1">
         <w:r>
           <w:rPr>
             <w:rStyle w:val="Hyperlink"/>
@@ -1542,7 +1542,7 @@
             <w:noProof/>
             <w:webHidden/>
           </w:rPr>
-          <w:instrText xml:space="preserve"> PAGEREF _Toc242892829 \h </w:instrText>
+          <w:instrText xml:space="preserve"> PAGEREF _Toc242904397 \h </w:instrText>
         </w:r>
         <w:r>
           <w:rPr>
@@ -1589,7 +1589,7 @@
           <w14:ligatures w14:val="standardContextual"/>
         </w:rPr>
       </w:pPr>
-      <w:hyperlink w:anchor="_Toc242892830" w:history="1">
+      <w:hyperlink w:anchor="_Toc242904398" w:history="1">
         <w:r>
           <w:rPr>
             <w:rStyle w:val="Hyperlink"/>
@@ -1616,7 +1616,7 @@
             <w:noProof/>
             <w:webHidden/>
           </w:rPr>
-          <w:instrText xml:space="preserve"> PAGEREF _Toc242892830 \h </w:instrText>
+          <w:instrText xml:space="preserve"> PAGEREF _Toc242904398 \h </w:instrText>
         </w:r>
         <w:r>
           <w:rPr>
@@ -1663,7 +1663,7 @@
           <w14:ligatures w14:val="standardContextual"/>
         </w:rPr>
       </w:pPr>
-      <w:hyperlink w:anchor="_Toc242892831" w:history="1">
+      <w:hyperlink w:anchor="_Toc242904399" w:history="1">
         <w:r>
           <w:rPr>
             <w:rStyle w:val="Hyperlink"/>
@@ -1690,7 +1690,7 @@
             <w:noProof/>
             <w:webHidden/>
           </w:rPr>
-          <w:instrText xml:space="preserve"> PAGEREF _Toc242892831 \h </w:instrText>
+          <w:instrText xml:space="preserve"> PAGEREF _Toc242904399 \h </w:instrText>
         </w:r>
         <w:r>
           <w:rPr>
@@ -1737,7 +1737,7 @@
           <w14:ligatures w14:val="standardContextual"/>
         </w:rPr>
       </w:pPr>
-      <w:hyperlink w:anchor="_Toc242892832" w:history="1">
+      <w:hyperlink w:anchor="_Toc242904400" w:history="1">
         <w:r>
           <w:rPr>
             <w:rStyle w:val="Hyperlink"/>
@@ -1764,7 +1764,7 @@
             <w:noProof/>
             <w:webHidden/>
           </w:rPr>
-          <w:instrText xml:space="preserve"> PAGEREF _Toc242892832 \h </w:instrText>
+          <w:instrText xml:space="preserve"> PAGEREF _Toc242904400 \h </w:instrText>
         </w:r>
         <w:r>
           <w:rPr>
@@ -1811,7 +1811,7 @@
           <w14:ligatures w14:val="standardContextual"/>
         </w:rPr>
       </w:pPr>
-      <w:hyperlink w:anchor="_Toc242892833" w:history="1">
+      <w:hyperlink w:anchor="_Toc242904401" w:history="1">
         <w:r>
           <w:rPr>
             <w:rStyle w:val="Hyperlink"/>
@@ -1838,7 +1838,7 @@
             <w:noProof/>
             <w:webHidden/>
           </w:rPr>
-          <w:instrText xml:space="preserve"> PAGEREF _Toc242892833 \h </w:instrText>
+          <w:instrText xml:space="preserve"> PAGEREF _Toc242904401 \h </w:instrText>
         </w:r>
         <w:r>
           <w:rPr>
@@ -1885,7 +1885,7 @@
           <w14:ligatures w14:val="standardContextual"/>
         </w:rPr>
       </w:pPr>
-      <w:hyperlink w:anchor="_Toc242892834" w:history="1">
+      <w:hyperlink w:anchor="_Toc242904402" w:history="1">
         <w:r>
           <w:rPr>
             <w:rStyle w:val="Hyperlink"/>
@@ -1912,7 +1912,7 @@
             <w:noProof/>
             <w:webHidden/>
           </w:rPr>
-          <w:instrText xml:space="preserve"> PAGEREF _Toc242892834 \h </w:instrText>
+          <w:instrText xml:space="preserve"> PAGEREF _Toc242904402 \h </w:instrText>
         </w:r>
         <w:r>
           <w:rPr>
@@ -1959,7 +1959,7 @@
           <w14:ligatures w14:val="standardContextual"/>
         </w:rPr>
       </w:pPr>
-      <w:hyperlink w:anchor="_Toc242892835" w:history="1">
+      <w:hyperlink w:anchor="_Toc242904403" w:history="1">
         <w:r>
           <w:rPr>
             <w:rStyle w:val="Hyperlink"/>
@@ -1986,7 +1986,7 @@
             <w:noProof/>
             <w:webHidden/>
           </w:rPr>
-          <w:instrText xml:space="preserve"> PAGEREF _Toc242892835 \h </w:instrText>
+          <w:instrText xml:space="preserve"> PAGEREF _Toc242904403 \h </w:instrText>
         </w:r>
         <w:r>
           <w:rPr>
@@ -2033,7 +2033,7 @@
           <w14:ligatures w14:val="standardContextual"/>
         </w:rPr>
       </w:pPr>
-      <w:hyperlink w:anchor="_Toc242892836" w:history="1">
+      <w:hyperlink w:anchor="_Toc242904404" w:history="1">
         <w:r>
           <w:rPr>
             <w:rStyle w:val="Hyperlink"/>
@@ -2060,7 +2060,7 @@
             <w:noProof/>
             <w:webHidden/>
           </w:rPr>
-          <w:instrText xml:space="preserve"> PAGEREF _Toc242892836 \h </w:instrText>
+          <w:instrText xml:space="preserve"> PAGEREF _Toc242904404 \h </w:instrText>
         </w:r>
         <w:r>
           <w:rPr>
@@ -2107,7 +2107,7 @@
           <w14:ligatures w14:val="standardContextual"/>
         </w:rPr>
       </w:pPr>
-      <w:hyperlink w:anchor="_Toc242892837" w:history="1">
+      <w:hyperlink w:anchor="_Toc242904405" w:history="1">
         <w:r>
           <w:rPr>
             <w:rStyle w:val="Hyperlink"/>
@@ -2134,7 +2134,7 @@
             <w:noProof/>
             <w:webHidden/>
           </w:rPr>
-          <w:instrText xml:space="preserve"> PAGEREF _Toc242892837 \h </w:instrText>
+          <w:instrText xml:space="preserve"> PAGEREF _Toc242904405 \h </w:instrText>
         </w:r>
         <w:r>
           <w:rPr>
@@ -2181,7 +2181,7 @@
           <w14:ligatures w14:val="standardContextual"/>
         </w:rPr>
       </w:pPr>
-      <w:hyperlink w:anchor="_Toc242892838" w:history="1">
+      <w:hyperlink w:anchor="_Toc242904406" w:history="1">
         <w:r>
           <w:rPr>
             <w:rStyle w:val="Hyperlink"/>
@@ -2208,7 +2208,7 @@
             <w:noProof/>
             <w:webHidden/>
           </w:rPr>
-          <w:instrText xml:space="preserve"> PAGEREF _Toc242892838 \h </w:instrText>
+          <w:instrText xml:space="preserve"> PAGEREF _Toc242904406 \h </w:instrText>
         </w:r>
         <w:r>
           <w:rPr>
@@ -2255,7 +2255,7 @@
           <w14:ligatures w14:val="standardContextual"/>
         </w:rPr>
       </w:pPr>
-      <w:hyperlink w:anchor="_Toc242892839" w:history="1">
+      <w:hyperlink w:anchor="_Toc242904407" w:history="1">
         <w:r>
           <w:rPr>
             <w:rStyle w:val="Hyperlink"/>
@@ -2282,7 +2282,7 @@
             <w:noProof/>
             <w:webHidden/>
           </w:rPr>
-          <w:instrText xml:space="preserve"> PAGEREF _Toc242892839 \h </w:instrText>
+          <w:instrText xml:space="preserve"> PAGEREF _Toc242904407 \h </w:instrText>
         </w:r>
         <w:r>
           <w:rPr>
@@ -2329,7 +2329,7 @@
           <w14:ligatures w14:val="standardContextual"/>
         </w:rPr>
       </w:pPr>
-      <w:hyperlink w:anchor="_Toc242892840" w:history="1">
+      <w:hyperlink w:anchor="_Toc242904408" w:history="1">
         <w:r>
           <w:rPr>
             <w:rStyle w:val="Hyperlink"/>
@@ -2356,7 +2356,7 @@
             <w:noProof/>
             <w:webHidden/>
           </w:rPr>
-          <w:instrText xml:space="preserve"> PAGEREF _Toc242892840 \h </w:instrText>
+          <w:instrText xml:space="preserve"> PAGEREF _Toc242904408 \h </w:instrText>
         </w:r>
         <w:r>
           <w:rPr>
@@ -2403,7 +2403,7 @@
           <w14:ligatures w14:val="standardContextual"/>
         </w:rPr>
       </w:pPr>
-      <w:hyperlink w:anchor="_Toc242892841" w:history="1">
+      <w:hyperlink w:anchor="_Toc242904409" w:history="1">
         <w:r>
           <w:rPr>
             <w:rStyle w:val="Hyperlink"/>
@@ -2430,7 +2430,7 @@
             <w:noProof/>
             <w:webHidden/>
           </w:rPr>
-          <w:instrText xml:space="preserve"> PAGEREF _Toc242892841 \h </w:instrText>
+          <w:instrText xml:space="preserve"> PAGEREF _Toc242904409 \h </w:instrText>
         </w:r>
         <w:r>
           <w:rPr>
@@ -2478,7 +2478,7 @@
           <w14:ligatures w14:val="standardContextual"/>
         </w:rPr>
       </w:pPr>
-      <w:hyperlink w:anchor="_Toc242892842" w:history="1">
+      <w:hyperlink w:anchor="_Toc242904410" w:history="1">
         <w:r>
           <w:rPr>
             <w:rStyle w:val="Hyperlink"/>
@@ -2505,7 +2505,7 @@
             <w:noProof/>
             <w:webHidden/>
           </w:rPr>
-          <w:instrText xml:space="preserve"> PAGEREF _Toc242892842 \h </w:instrText>
+          <w:instrText xml:space="preserve"> PAGEREF _Toc242904410 \h </w:instrText>
         </w:r>
         <w:r>
           <w:rPr>
@@ -2552,7 +2552,7 @@
           <w14:ligatures w14:val="standardContextual"/>
         </w:rPr>
       </w:pPr>
-      <w:hyperlink w:anchor="_Toc242892843" w:history="1">
+      <w:hyperlink w:anchor="_Toc242904411" w:history="1">
         <w:r>
           <w:rPr>
             <w:rStyle w:val="Hyperlink"/>
@@ -2579,7 +2579,7 @@
             <w:noProof/>
             <w:webHidden/>
           </w:rPr>
-          <w:instrText xml:space="preserve"> PAGEREF _Toc242892843 \h </w:instrText>
+          <w:instrText xml:space="preserve"> PAGEREF _Toc242904411 \h </w:instrText>
         </w:r>
         <w:r>
           <w:rPr>
@@ -2626,7 +2626,7 @@
           <w14:ligatures w14:val="standardContextual"/>
         </w:rPr>
       </w:pPr>
-      <w:hyperlink w:anchor="_Toc242892844" w:history="1">
+      <w:hyperlink w:anchor="_Toc242904412" w:history="1">
         <w:r>
           <w:rPr>
             <w:rStyle w:val="Hyperlink"/>
@@ -2653,7 +2653,7 @@
             <w:noProof/>
             <w:webHidden/>
           </w:rPr>
-          <w:instrText xml:space="preserve"> PAGEREF _Toc242892844 \h </w:instrText>
+          <w:instrText xml:space="preserve"> PAGEREF _Toc242904412 \h </w:instrText>
         </w:r>
         <w:r>
           <w:rPr>
@@ -2700,7 +2700,7 @@
           <w14:ligatures w14:val="standardContextual"/>
         </w:rPr>
       </w:pPr>
-      <w:hyperlink w:anchor="_Toc242892845" w:history="1">
+      <w:hyperlink w:anchor="_Toc242904413" w:history="1">
         <w:r>
           <w:rPr>
             <w:rStyle w:val="Hyperlink"/>
@@ -2727,7 +2727,7 @@
             <w:noProof/>
             <w:webHidden/>
           </w:rPr>
-          <w:instrText xml:space="preserve"> PAGEREF _Toc242892845 \h </w:instrText>
+          <w:instrText xml:space="preserve"> PAGEREF _Toc242904413 \h </w:instrText>
         </w:r>
         <w:r>
           <w:rPr>
@@ -2775,7 +2775,7 @@
           <w14:ligatures w14:val="standardContextual"/>
         </w:rPr>
       </w:pPr>
-      <w:hyperlink w:anchor="_Toc242892846" w:history="1">
+      <w:hyperlink w:anchor="_Toc242904414" w:history="1">
         <w:r>
           <w:rPr>
             <w:rStyle w:val="Hyperlink"/>
@@ -2802,7 +2802,7 @@
             <w:noProof/>
             <w:webHidden/>
           </w:rPr>
-          <w:instrText xml:space="preserve"> PAGEREF _Toc242892846 \h </w:instrText>
+          <w:instrText xml:space="preserve"> PAGEREF _Toc242904414 \h </w:instrText>
         </w:r>
         <w:r>
           <w:rPr>
@@ -2849,7 +2849,7 @@
           <w14:ligatures w14:val="standardContextual"/>
         </w:rPr>
       </w:pPr>
-      <w:hyperlink w:anchor="_Toc242892847" w:history="1">
+      <w:hyperlink w:anchor="_Toc242904415" w:history="1">
         <w:r>
           <w:rPr>
             <w:rStyle w:val="Hyperlink"/>
@@ -2876,7 +2876,7 @@
             <w:noProof/>
             <w:webHidden/>
           </w:rPr>
-          <w:instrText xml:space="preserve"> PAGEREF _Toc242892847 \h </w:instrText>
+          <w:instrText xml:space="preserve"> PAGEREF _Toc242904415 \h </w:instrText>
         </w:r>
         <w:r>
           <w:rPr>
@@ -2923,7 +2923,7 @@
           <w14:ligatures w14:val="standardContextual"/>
         </w:rPr>
       </w:pPr>
-      <w:hyperlink w:anchor="_Toc242892848" w:history="1">
+      <w:hyperlink w:anchor="_Toc242904416" w:history="1">
         <w:r>
           <w:rPr>
             <w:rStyle w:val="Hyperlink"/>
@@ -2950,7 +2950,7 @@
             <w:noProof/>
             <w:webHidden/>
           </w:rPr>
-          <w:instrText xml:space="preserve"> PAGEREF _Toc242892848 \h </w:instrText>
+          <w:instrText xml:space="preserve"> PAGEREF _Toc242904416 \h </w:instrText>
         </w:r>
         <w:r>
           <w:rPr>
@@ -2997,7 +2997,7 @@
           <w14:ligatures w14:val="standardContextual"/>
         </w:rPr>
       </w:pPr>
-      <w:hyperlink w:anchor="_Toc242892849" w:history="1">
+      <w:hyperlink w:anchor="_Toc242904417" w:history="1">
         <w:r>
           <w:rPr>
             <w:rStyle w:val="Hyperlink"/>
@@ -3024,7 +3024,7 @@
             <w:noProof/>
             <w:webHidden/>
           </w:rPr>
-          <w:instrText xml:space="preserve"> PAGEREF _Toc242892849 \h </w:instrText>
+          <w:instrText xml:space="preserve"> PAGEREF _Toc242904417 \h </w:instrText>
         </w:r>
         <w:r>
           <w:rPr>
@@ -3071,7 +3071,7 @@
           <w14:ligatures w14:val="standardContextual"/>
         </w:rPr>
       </w:pPr>
-      <w:hyperlink w:anchor="_Toc242892850" w:history="1">
+      <w:hyperlink w:anchor="_Toc242904418" w:history="1">
         <w:r>
           <w:rPr>
             <w:rStyle w:val="Hyperlink"/>
@@ -3098,7 +3098,7 @@
             <w:noProof/>
             <w:webHidden/>
           </w:rPr>
-          <w:instrText xml:space="preserve"> PAGEREF _Toc242892850 \h </w:instrText>
+          <w:instrText xml:space="preserve"> PAGEREF _Toc242904418 \h </w:instrText>
         </w:r>
         <w:r>
           <w:rPr>
@@ -3146,7 +3146,7 @@
           <w14:ligatures w14:val="standardContextual"/>
         </w:rPr>
       </w:pPr>
-      <w:hyperlink w:anchor="_Toc242892851" w:history="1">
+      <w:hyperlink w:anchor="_Toc242904419" w:history="1">
         <w:r>
           <w:rPr>
             <w:rStyle w:val="Hyperlink"/>
@@ -3173,7 +3173,7 @@
             <w:noProof/>
             <w:webHidden/>
           </w:rPr>
-          <w:instrText xml:space="preserve"> PAGEREF _Toc242892851 \h </w:instrText>
+          <w:instrText xml:space="preserve"> PAGEREF _Toc242904419 \h </w:instrText>
         </w:r>
         <w:r>
           <w:rPr>
@@ -3220,7 +3220,7 @@
           <w14:ligatures w14:val="standardContextual"/>
         </w:rPr>
       </w:pPr>
-      <w:hyperlink w:anchor="_Toc242892852" w:history="1">
+      <w:hyperlink w:anchor="_Toc242904420" w:history="1">
         <w:r>
           <w:rPr>
             <w:rStyle w:val="Hyperlink"/>
@@ -3247,7 +3247,7 @@
             <w:noProof/>
             <w:webHidden/>
           </w:rPr>
-          <w:instrText xml:space="preserve"> PAGEREF _Toc242892852 \h </w:instrText>
+          <w:instrText xml:space="preserve"> PAGEREF _Toc242904420 \h </w:instrText>
         </w:r>
         <w:r>
           <w:rPr>
@@ -3294,7 +3294,7 @@
           <w14:ligatures w14:val="standardContextual"/>
         </w:rPr>
       </w:pPr>
-      <w:hyperlink w:anchor="_Toc242892853" w:history="1">
+      <w:hyperlink w:anchor="_Toc242904421" w:history="1">
         <w:r>
           <w:rPr>
             <w:rStyle w:val="Hyperlink"/>
@@ -3321,7 +3321,7 @@
             <w:noProof/>
             <w:webHidden/>
           </w:rPr>
-          <w:instrText xml:space="preserve"> PAGEREF _Toc242892853 \h </w:instrText>
+          <w:instrText xml:space="preserve"> PAGEREF _Toc242904421 \h </w:instrText>
         </w:r>
         <w:r>
           <w:rPr>
@@ -3389,7 +3389,7 @@
       <w:bookmarkStart w:id="7" w:name="_Toc242875938"/>
       <w:bookmarkStart w:id="8" w:name="_Toc242876903"/>
       <w:bookmarkStart w:id="9" w:name="_Toc242877888"/>
-      <w:bookmarkStart w:id="10" w:name="_Toc242892816"/>
+      <w:bookmarkStart w:id="10" w:name="_Toc242904384"/>
       <w:r>
         <w:lastRenderedPageBreak/>
         <w:t>Chương 1 Phạm vi và hệ thống thực hành Tuần 2</w:t>
@@ -3420,7 +3420,7 @@
       <w:bookmarkStart w:id="18" w:name="_Toc242875939"/>
       <w:bookmarkStart w:id="19" w:name="_Toc242876904"/>
       <w:bookmarkStart w:id="20" w:name="_Toc242877889"/>
-      <w:bookmarkStart w:id="21" w:name="_Toc242892817"/>
+      <w:bookmarkStart w:id="21" w:name="_Toc242904385"/>
       <w:r>
         <w:t>1.1 Mục tiêu và phạm vi số liệu</w:t>
       </w:r>
@@ -3468,7 +3468,7 @@
       <w:bookmarkStart w:id="29" w:name="_Toc242875940"/>
       <w:bookmarkStart w:id="30" w:name="_Toc242876905"/>
       <w:bookmarkStart w:id="31" w:name="_Toc242877890"/>
-      <w:bookmarkStart w:id="32" w:name="_Toc242892818"/>
+      <w:bookmarkStart w:id="32" w:name="_Toc242904386"/>
       <w:r>
         <w:t>1.2 Phân công và thời gian thực hiện</w:t>
       </w:r>
@@ -3800,7 +3800,7 @@
       <w:bookmarkStart w:id="40" w:name="_Toc242875941"/>
       <w:bookmarkStart w:id="41" w:name="_Toc242876906"/>
       <w:bookmarkStart w:id="42" w:name="_Toc242877891"/>
-      <w:bookmarkStart w:id="43" w:name="_Toc242892819"/>
+      <w:bookmarkStart w:id="43" w:name="_Toc242904387"/>
       <w:r>
         <w:lastRenderedPageBreak/>
         <w:t>1.3 Kiến trúc và luồng xử lý</w:t>
@@ -3898,7 +3898,7 @@
       <w:bookmarkStart w:id="51" w:name="_Toc242875942"/>
       <w:bookmarkStart w:id="52" w:name="_Toc242876907"/>
       <w:bookmarkStart w:id="53" w:name="_Toc242877892"/>
-      <w:bookmarkStart w:id="54" w:name="_Toc242892820"/>
+      <w:bookmarkStart w:id="54" w:name="_Toc242904388"/>
       <w:r>
         <w:lastRenderedPageBreak/>
         <w:t>1.4 Trạng thái dịch vụ trong dữ liệu Tuần 2</w:t>
@@ -4351,7 +4351,7 @@
       <w:bookmarkStart w:id="62" w:name="_Toc242875943"/>
       <w:bookmarkStart w:id="63" w:name="_Toc242876908"/>
       <w:bookmarkStart w:id="64" w:name="_Toc242877893"/>
-      <w:bookmarkStart w:id="65" w:name="_Toc242892821"/>
+      <w:bookmarkStart w:id="65" w:name="_Toc242904389"/>
       <w:r>
         <w:lastRenderedPageBreak/>
         <w:t>Chương 2 Nguồn dữ liệu và phương pháp phân tích</w:t>
@@ -4382,7 +4382,7 @@
       <w:bookmarkStart w:id="73" w:name="_Toc242875944"/>
       <w:bookmarkStart w:id="74" w:name="_Toc242876909"/>
       <w:bookmarkStart w:id="75" w:name="_Toc242877894"/>
-      <w:bookmarkStart w:id="76" w:name="_Toc242892822"/>
+      <w:bookmarkStart w:id="76" w:name="_Toc242904390"/>
       <w:r>
         <w:t>2.1 Toàn bộ dữ liệu và mẫu thuộc Tuần 2</w:t>
       </w:r>
@@ -4883,7 +4883,7 @@
       <w:bookmarkStart w:id="84" w:name="_Toc242875945"/>
       <w:bookmarkStart w:id="85" w:name="_Toc242876910"/>
       <w:bookmarkStart w:id="86" w:name="_Toc242877895"/>
-      <w:bookmarkStart w:id="87" w:name="_Toc242892823"/>
+      <w:bookmarkStart w:id="87" w:name="_Toc242904391"/>
       <w:r>
         <w:lastRenderedPageBreak/>
         <w:t>2.2 Cấu trúc và chất lượng bản ghi</w:t>
@@ -5264,7 +5264,7 @@
       <w:bookmarkStart w:id="90" w:name="_Toc242875946"/>
       <w:bookmarkStart w:id="91" w:name="_Toc242876911"/>
       <w:bookmarkStart w:id="92" w:name="_Toc242877896"/>
-      <w:bookmarkStart w:id="93" w:name="_Toc242892824"/>
+      <w:bookmarkStart w:id="93" w:name="_Toc242904392"/>
       <w:r>
         <w:t>2.3 Hai bộ báo cáo dữ liệu của nhóm</w:t>
       </w:r>
@@ -5307,7 +5307,7 @@
       <w:bookmarkStart w:id="101" w:name="_Toc242875947"/>
       <w:bookmarkStart w:id="102" w:name="_Toc242876912"/>
       <w:bookmarkStart w:id="103" w:name="_Toc242877897"/>
-      <w:bookmarkStart w:id="104" w:name="_Toc242892825"/>
+      <w:bookmarkStart w:id="104" w:name="_Toc242904393"/>
       <w:r>
         <w:lastRenderedPageBreak/>
         <w:t>2.4 Các đại lượng và cách diễn giải</w:t>
@@ -5674,7 +5674,7 @@
       <w:bookmarkStart w:id="112" w:name="_Toc242875948"/>
       <w:bookmarkStart w:id="113" w:name="_Toc242876913"/>
       <w:bookmarkStart w:id="114" w:name="_Toc242877898"/>
-      <w:bookmarkStart w:id="115" w:name="_Toc242892826"/>
+      <w:bookmarkStart w:id="115" w:name="_Toc242904394"/>
       <w:r>
         <w:lastRenderedPageBreak/>
         <w:t>2.5 Thiết kế chức năng thu thập bằng Lambda</w:t>
@@ -6140,7 +6140,7 @@
       <w:bookmarkStart w:id="123" w:name="_Toc242875949"/>
       <w:bookmarkStart w:id="124" w:name="_Toc242876914"/>
       <w:bookmarkStart w:id="125" w:name="_Toc242877899"/>
-      <w:bookmarkStart w:id="126" w:name="_Toc242892827"/>
+      <w:bookmarkStart w:id="126" w:name="_Toc242904395"/>
       <w:r>
         <w:lastRenderedPageBreak/>
         <w:t>2.6 Lược đồ bản ghi và truy vấn dữ liệu</w:t>
@@ -8093,7 +8093,7 @@
       <w:bookmarkStart w:id="134" w:name="_Toc242875950"/>
       <w:bookmarkStart w:id="135" w:name="_Toc242876915"/>
       <w:bookmarkStart w:id="136" w:name="_Toc242877900"/>
-      <w:bookmarkStart w:id="137" w:name="_Toc242892828"/>
+      <w:bookmarkStart w:id="137" w:name="_Toc242904396"/>
       <w:r>
         <w:lastRenderedPageBreak/>
         <w:t>2.7 Quyền kích hoạt và điều kiện gửi thông báo</w:t>
@@ -8144,7 +8144,7 @@
       <w:bookmarkStart w:id="145" w:name="_Toc242875951"/>
       <w:bookmarkStart w:id="146" w:name="_Toc242876916"/>
       <w:bookmarkStart w:id="147" w:name="_Toc242877901"/>
-      <w:bookmarkStart w:id="148" w:name="_Toc242892829"/>
+      <w:bookmarkStart w:id="148" w:name="_Toc242904397"/>
       <w:r>
         <w:lastRenderedPageBreak/>
         <w:t>Chương 3 Phân tích dữ liệu môi trường Tuần 2</w:t>
@@ -8175,7 +8175,7 @@
       <w:bookmarkStart w:id="156" w:name="_Toc242875952"/>
       <w:bookmarkStart w:id="157" w:name="_Toc242876917"/>
       <w:bookmarkStart w:id="158" w:name="_Toc242877902"/>
-      <w:bookmarkStart w:id="159" w:name="_Toc242892830"/>
+      <w:bookmarkStart w:id="159" w:name="_Toc242904398"/>
       <w:r>
         <w:t>3.1 So sánh AQI theo đô thị</w:t>
       </w:r>
@@ -9282,7 +9282,7 @@
       <w:bookmarkStart w:id="167" w:name="_Toc242875953"/>
       <w:bookmarkStart w:id="168" w:name="_Toc242876918"/>
       <w:bookmarkStart w:id="169" w:name="_Toc242877903"/>
-      <w:bookmarkStart w:id="170" w:name="_Toc242892831"/>
+      <w:bookmarkStart w:id="170" w:name="_Toc242904399"/>
       <w:r>
         <w:lastRenderedPageBreak/>
         <w:t>3.2 Nồng độ PM2.5 và PM10</w:t>
@@ -10255,7 +10255,7 @@
       <w:bookmarkStart w:id="178" w:name="_Toc242875954"/>
       <w:bookmarkStart w:id="179" w:name="_Toc242876919"/>
       <w:bookmarkStart w:id="180" w:name="_Toc242877904"/>
-      <w:bookmarkStart w:id="181" w:name="_Toc242892832"/>
+      <w:bookmarkStart w:id="181" w:name="_Toc242904400"/>
       <w:r>
         <w:lastRenderedPageBreak/>
         <w:t>3.3 Trung vị tứ phân vị và P95</w:t>
@@ -11363,7 +11363,7 @@
       <w:bookmarkStart w:id="189" w:name="_Toc242875955"/>
       <w:bookmarkStart w:id="190" w:name="_Toc242876920"/>
       <w:bookmarkStart w:id="191" w:name="_Toc242877905"/>
-      <w:bookmarkStart w:id="192" w:name="_Toc242892833"/>
+      <w:bookmarkStart w:id="192" w:name="_Toc242904401"/>
       <w:r>
         <w:lastRenderedPageBreak/>
         <w:t>3.4 Diễn biến tại các giờ có quan trắc</w:t>
@@ -12212,7 +12212,7 @@
       <w:bookmarkStart w:id="200" w:name="_Toc242875956"/>
       <w:bookmarkStart w:id="201" w:name="_Toc242876921"/>
       <w:bookmarkStart w:id="202" w:name="_Toc242877906"/>
-      <w:bookmarkStart w:id="203" w:name="_Toc242892834"/>
+      <w:bookmarkStart w:id="203" w:name="_Toc242904402"/>
       <w:r>
         <w:lastRenderedPageBreak/>
         <w:t>3.5 Độ phủ và mật độ lấy mẫu</w:t>
@@ -12319,7 +12319,7 @@
       <w:bookmarkStart w:id="211" w:name="_Toc242875957"/>
       <w:bookmarkStart w:id="212" w:name="_Toc242876922"/>
       <w:bookmarkStart w:id="213" w:name="_Toc242877907"/>
-      <w:bookmarkStart w:id="214" w:name="_Toc242892835"/>
+      <w:bookmarkStart w:id="214" w:name="_Toc242904403"/>
       <w:r>
         <w:lastRenderedPageBreak/>
         <w:t>3.6 Phân bố các cấp chất lượng không khí</w:t>
@@ -13157,7 +13157,7 @@
       <w:bookmarkStart w:id="222" w:name="_Toc242875958"/>
       <w:bookmarkStart w:id="223" w:name="_Toc242876923"/>
       <w:bookmarkStart w:id="224" w:name="_Toc242877908"/>
-      <w:bookmarkStart w:id="225" w:name="_Toc242892836"/>
+      <w:bookmarkStart w:id="225" w:name="_Toc242904404"/>
       <w:r>
         <w:lastRenderedPageBreak/>
         <w:t>3.7 Tần suất vượt ngưỡng cấu hình cảnh báo</w:t>
@@ -14000,7 +14000,7 @@
       <w:bookmarkStart w:id="228" w:name="_Toc242875959"/>
       <w:bookmarkStart w:id="229" w:name="_Toc242876924"/>
       <w:bookmarkStart w:id="230" w:name="_Toc242877909"/>
-      <w:bookmarkStart w:id="231" w:name="_Toc242892837"/>
+      <w:bookmarkStart w:id="231" w:name="_Toc242904405"/>
       <w:r>
         <w:lastRenderedPageBreak/>
         <w:t>3.8 Đối chiếu hai báo cáo dữ liệu theo đô thị và giờ</w:t>
@@ -14649,7 +14649,7 @@
       <w:bookmarkStart w:id="239" w:name="_Toc242875960"/>
       <w:bookmarkStart w:id="240" w:name="_Toc242876925"/>
       <w:bookmarkStart w:id="241" w:name="_Toc242877910"/>
-      <w:bookmarkStart w:id="242" w:name="_Toc242892838"/>
+      <w:bookmarkStart w:id="242" w:name="_Toc242904406"/>
       <w:r>
         <w:lastRenderedPageBreak/>
         <w:t>3.9 Tương quan Pearson và Spearman</w:t>
@@ -15631,7 +15631,7 @@
       <w:bookmarkStart w:id="250" w:name="_Toc242875961"/>
       <w:bookmarkStart w:id="251" w:name="_Toc242876926"/>
       <w:bookmarkStart w:id="252" w:name="_Toc242877911"/>
-      <w:bookmarkStart w:id="253" w:name="_Toc242892839"/>
+      <w:bookmarkStart w:id="253" w:name="_Toc242904407"/>
       <w:r>
         <w:lastRenderedPageBreak/>
         <w:t>3.10 Quan sát trực tiếp quan hệ nhiệt độ và PM2.5</w:t>
@@ -15738,7 +15738,7 @@
       <w:bookmarkStart w:id="261" w:name="_Toc242875962"/>
       <w:bookmarkStart w:id="262" w:name="_Toc242876927"/>
       <w:bookmarkStart w:id="263" w:name="_Toc242877912"/>
-      <w:bookmarkStart w:id="264" w:name="_Toc242892840"/>
+      <w:bookmarkStart w:id="264" w:name="_Toc242904408"/>
       <w:r>
         <w:lastRenderedPageBreak/>
         <w:t>3.11 Các khí ô nhiễm còn lại</w:t>
@@ -16708,7 +16708,7 @@
       <w:bookmarkStart w:id="269" w:name="_Toc242875963"/>
       <w:bookmarkStart w:id="270" w:name="_Toc242876928"/>
       <w:bookmarkStart w:id="271" w:name="_Toc242877913"/>
-      <w:bookmarkStart w:id="272" w:name="_Toc242892841"/>
+      <w:bookmarkStart w:id="272" w:name="_Toc242904409"/>
       <w:r>
         <w:lastRenderedPageBreak/>
         <w:t>3.12 Đối chiếu với báo cáo Tuần 1</w:t>
@@ -19048,7 +19048,7 @@
       <w:bookmarkStart w:id="280" w:name="_Toc242875964"/>
       <w:bookmarkStart w:id="281" w:name="_Toc242876929"/>
       <w:bookmarkStart w:id="282" w:name="_Toc242877914"/>
-      <w:bookmarkStart w:id="283" w:name="_Toc242892842"/>
+      <w:bookmarkStart w:id="283" w:name="_Toc242904410"/>
       <w:r>
         <w:lastRenderedPageBreak/>
         <w:t>Chương 4 Phân tích vận hành Lambda và SNS</w:t>
@@ -19079,7 +19079,7 @@
       <w:bookmarkStart w:id="291" w:name="_Toc242875965"/>
       <w:bookmarkStart w:id="292" w:name="_Toc242876930"/>
       <w:bookmarkStart w:id="293" w:name="_Toc242877915"/>
-      <w:bookmarkStart w:id="294" w:name="_Toc242892843"/>
+      <w:bookmarkStart w:id="294" w:name="_Toc242904411"/>
       <w:r>
         <w:t>4.1 Thời gian thực thi và bộ nhớ Lambda</w:t>
       </w:r>
@@ -19580,7 +19580,7 @@
       <w:bookmarkStart w:id="302" w:name="_Toc242875966"/>
       <w:bookmarkStart w:id="303" w:name="_Toc242876931"/>
       <w:bookmarkStart w:id="304" w:name="_Toc242877916"/>
-      <w:bookmarkStart w:id="305" w:name="_Toc242892844"/>
+      <w:bookmarkStart w:id="305" w:name="_Toc242904412"/>
       <w:r>
         <w:lastRenderedPageBreak/>
         <w:t>4.2 Lịch thu thập và thông báo SNS</w:t>
@@ -19966,7 +19966,7 @@
       <w:bookmarkStart w:id="313" w:name="_Toc242875967"/>
       <w:bookmarkStart w:id="314" w:name="_Toc242876932"/>
       <w:bookmarkStart w:id="315" w:name="_Toc242877917"/>
-      <w:bookmarkStart w:id="316" w:name="_Toc242892845"/>
+      <w:bookmarkStart w:id="316" w:name="_Toc242904413"/>
       <w:r>
         <w:t>4.3 Đối chiếu sự nhất quán của chỉ số vận hành</w:t>
       </w:r>
@@ -20353,7 +20353,7 @@
       <w:bookmarkStart w:id="324" w:name="_Toc242875968"/>
       <w:bookmarkStart w:id="325" w:name="_Toc242876933"/>
       <w:bookmarkStart w:id="326" w:name="_Toc242877918"/>
-      <w:bookmarkStart w:id="327" w:name="_Toc242892846"/>
+      <w:bookmarkStart w:id="327" w:name="_Toc242904414"/>
       <w:r>
         <w:lastRenderedPageBreak/>
         <w:t>Chương 5 Phân tích truy vấn và sử dụng tài nguyên</w:t>
@@ -20384,7 +20384,7 @@
       <w:bookmarkStart w:id="335" w:name="_Toc242875969"/>
       <w:bookmarkStart w:id="336" w:name="_Toc242876934"/>
       <w:bookmarkStart w:id="337" w:name="_Toc242877919"/>
-      <w:bookmarkStart w:id="338" w:name="_Toc242892847"/>
+      <w:bookmarkStart w:id="338" w:name="_Toc242904415"/>
       <w:r>
         <w:t>5.1 Đối chứng hiệu quả lọc phân vùng</w:t>
       </w:r>
@@ -20826,7 +20826,7 @@
       <w:bookmarkStart w:id="346" w:name="_Toc242875970"/>
       <w:bookmarkStart w:id="347" w:name="_Toc242876935"/>
       <w:bookmarkStart w:id="348" w:name="_Toc242877920"/>
-      <w:bookmarkStart w:id="349" w:name="_Toc242892848"/>
+      <w:bookmarkStart w:id="349" w:name="_Toc242904416"/>
       <w:r>
         <w:lastRenderedPageBreak/>
         <w:t>5.2 Hai mươi bốn truy vấn phân tích mới</w:t>
@@ -22215,7 +22215,7 @@
       <w:bookmarkStart w:id="357" w:name="_Toc242875971"/>
       <w:bookmarkStart w:id="358" w:name="_Toc242876936"/>
       <w:bookmarkStart w:id="359" w:name="_Toc242877921"/>
-      <w:bookmarkStart w:id="360" w:name="_Toc242892849"/>
+      <w:bookmarkStart w:id="360" w:name="_Toc242904417"/>
       <w:r>
         <w:t>5.3 Lịch sử truy vấn và phạm vi lỗi</w:t>
       </w:r>
@@ -22533,7 +22533,7 @@
       <w:bookmarkStart w:id="368" w:name="_Toc242875972"/>
       <w:bookmarkStart w:id="369" w:name="_Toc242876937"/>
       <w:bookmarkStart w:id="370" w:name="_Toc242877922"/>
-      <w:bookmarkStart w:id="371" w:name="_Toc242892850"/>
+      <w:bookmarkStart w:id="371" w:name="_Toc242904418"/>
       <w:r>
         <w:lastRenderedPageBreak/>
         <w:t>5.4 Chi phí từ Cost Explorer</w:t>
@@ -22834,7 +22834,7 @@
         <w:ind w:firstLine="504"/>
       </w:pPr>
       <w:r>
-        <w:t>Chi phí UnblendedCost hiển thị đến cent là 0,00 USD trong báo cáo dữ liệu của sinh viên Tiến Sơn và 0,03 USD trong báo cáo của sinh viên Ngọc Quyên. Phản hồi gốc của sinh viên Tiến Sơn chứa tổng −0,0000000764 USD từ các dòng rất nhỏ ở Secrets Manager và CloudWatch; tổng này làm tròn thành 0,00 USD. Bộ dữ liệu hiện không có loại khoản phí để xác định nguyên nhân cụ thể của phần âm. CSV giữ nguyên giá trị gốc, không đổi số âm thành số dương hoặc xóa khoản đó.</w:t>
+        <w:t>Trong phạm vi Tuần 2, UnblendedCost được trình bày đến cent là 0,00 USD trong báo cáo dữ liệu của sinh viên Tiến Sơn và 0,03 USD trong báo cáo dữ liệu của sinh viên Ngọc Quyên. Tổng giá trị trước khi làm tròn của sinh viên Tiến Sơn có độ lớn dưới 0,000001 USD, nên được hiển thị 0,00 USD ở độ chính xác này. Mức hiển thị 0,00 USD không đồng nghĩa với kết luận dự án hoàn toàn miễn phí.</w:t>
       </w:r>
     </w:p>
     <w:p>
@@ -22843,7 +22843,7 @@
         <w:ind w:firstLine="504"/>
       </w:pPr>
       <w:r>
-        <w:t>Kết quả có cờ Estimated và được tổng hợp theo môi trường AWS của từng sinh viên, dịch vụ và ngày. Các số này mô tả chi phí ghi nhận trong từng báo cáo dữ liệu, chưa phải hóa đơn cuối cùng hoặc chi phí phân bổ riêng bằng tag dự án. CSV giữ giá trị gốc, đơn vị và cờ ước tính.</w:t>
+        <w:t>Cả hai kết quả đều có cờ Estimated. Đây là số liệu ước tính tại thời điểm trích xuất Cost Explorer, được tổng hợp theo dịch vụ và ngày trong môi trường AWS của từng sinh viên; chưa phải hóa đơn cuối cùng hoặc chi phí riêng của dự án được phân bổ bằng tag. Các tệp CSV lưu nguyên giá trị trước khi làm tròn, đơn vị và trạng thái ước tính để đối chiếu.</w:t>
       </w:r>
     </w:p>
     <w:p>
@@ -22862,7 +22862,7 @@
       <w:bookmarkStart w:id="379" w:name="_Toc242875973"/>
       <w:bookmarkStart w:id="380" w:name="_Toc242876938"/>
       <w:bookmarkStart w:id="381" w:name="_Toc242877923"/>
-      <w:bookmarkStart w:id="382" w:name="_Toc242892851"/>
+      <w:bookmarkStart w:id="382" w:name="_Toc242904419"/>
       <w:r>
         <w:lastRenderedPageBreak/>
         <w:t>Chương 6 Tổng hợp kết quả Tuần 2</w:t>
@@ -22893,7 +22893,7 @@
       <w:bookmarkStart w:id="390" w:name="_Toc242875974"/>
       <w:bookmarkStart w:id="391" w:name="_Toc242876939"/>
       <w:bookmarkStart w:id="392" w:name="_Toc242877924"/>
-      <w:bookmarkStart w:id="393" w:name="_Toc242892852"/>
+      <w:bookmarkStart w:id="393" w:name="_Toc242904420"/>
       <w:r>
         <w:t>6.1 Sản phẩm dữ liệu và phân tích</w:t>
       </w:r>
@@ -23257,7 +23257,7 @@
       <w:bookmarkStart w:id="401" w:name="_Toc242875975"/>
       <w:bookmarkStart w:id="402" w:name="_Toc242876940"/>
       <w:bookmarkStart w:id="403" w:name="_Toc242877925"/>
-      <w:bookmarkStart w:id="404" w:name="_Toc242892853"/>
+      <w:bookmarkStart w:id="404" w:name="_Toc242904421"/>
       <w:r>
         <w:t>6.2 Kết luận trong phạm vi mẫu đã thu thập</w:t>
       </w:r>

</xml_diff>

<commit_message>
docs: add clearly labeled projected week two cost
</commit_message>
<xml_diff>
--- a/tuan_2/docs/Bao_cao_Tuan_2_24110054_24110051.docx
+++ b/tuan_2/docs/Bao_cao_Tuan_2_24110054_24110051.docx
@@ -551,7 +551,7 @@
         </w:rPr>
         <w:fldChar w:fldCharType="separate"/>
       </w:r>
-      <w:hyperlink w:anchor="_Toc242904384" w:history="1">
+      <w:hyperlink w:anchor="_Toc242904932" w:history="1">
         <w:r>
           <w:rPr>
             <w:rStyle w:val="Hyperlink"/>
@@ -578,7 +578,7 @@
             <w:noProof/>
             <w:webHidden/>
           </w:rPr>
-          <w:instrText xml:space="preserve"> PAGEREF _Toc242904384 \h </w:instrText>
+          <w:instrText xml:space="preserve"> PAGEREF _Toc242904932 \h </w:instrText>
         </w:r>
         <w:r>
           <w:rPr>
@@ -625,7 +625,7 @@
           <w14:ligatures w14:val="standardContextual"/>
         </w:rPr>
       </w:pPr>
-      <w:hyperlink w:anchor="_Toc242904385" w:history="1">
+      <w:hyperlink w:anchor="_Toc242904933" w:history="1">
         <w:r>
           <w:rPr>
             <w:rStyle w:val="Hyperlink"/>
@@ -652,7 +652,7 @@
             <w:noProof/>
             <w:webHidden/>
           </w:rPr>
-          <w:instrText xml:space="preserve"> PAGEREF _Toc242904385 \h </w:instrText>
+          <w:instrText xml:space="preserve"> PAGEREF _Toc242904933 \h </w:instrText>
         </w:r>
         <w:r>
           <w:rPr>
@@ -699,7 +699,7 @@
           <w14:ligatures w14:val="standardContextual"/>
         </w:rPr>
       </w:pPr>
-      <w:hyperlink w:anchor="_Toc242904386" w:history="1">
+      <w:hyperlink w:anchor="_Toc242904934" w:history="1">
         <w:r>
           <w:rPr>
             <w:rStyle w:val="Hyperlink"/>
@@ -726,7 +726,7 @@
             <w:noProof/>
             <w:webHidden/>
           </w:rPr>
-          <w:instrText xml:space="preserve"> PAGEREF _Toc242904386 \h </w:instrText>
+          <w:instrText xml:space="preserve"> PAGEREF _Toc242904934 \h </w:instrText>
         </w:r>
         <w:r>
           <w:rPr>
@@ -773,7 +773,7 @@
           <w14:ligatures w14:val="standardContextual"/>
         </w:rPr>
       </w:pPr>
-      <w:hyperlink w:anchor="_Toc242904387" w:history="1">
+      <w:hyperlink w:anchor="_Toc242904935" w:history="1">
         <w:r>
           <w:rPr>
             <w:rStyle w:val="Hyperlink"/>
@@ -800,7 +800,7 @@
             <w:noProof/>
             <w:webHidden/>
           </w:rPr>
-          <w:instrText xml:space="preserve"> PAGEREF _Toc242904387 \h </w:instrText>
+          <w:instrText xml:space="preserve"> PAGEREF _Toc242904935 \h </w:instrText>
         </w:r>
         <w:r>
           <w:rPr>
@@ -847,7 +847,7 @@
           <w14:ligatures w14:val="standardContextual"/>
         </w:rPr>
       </w:pPr>
-      <w:hyperlink w:anchor="_Toc242904388" w:history="1">
+      <w:hyperlink w:anchor="_Toc242904936" w:history="1">
         <w:r>
           <w:rPr>
             <w:rStyle w:val="Hyperlink"/>
@@ -874,7 +874,7 @@
             <w:noProof/>
             <w:webHidden/>
           </w:rPr>
-          <w:instrText xml:space="preserve"> PAGEREF _Toc242904388 \h </w:instrText>
+          <w:instrText xml:space="preserve"> PAGEREF _Toc242904936 \h </w:instrText>
         </w:r>
         <w:r>
           <w:rPr>
@@ -922,7 +922,7 @@
           <w14:ligatures w14:val="standardContextual"/>
         </w:rPr>
       </w:pPr>
-      <w:hyperlink w:anchor="_Toc242904389" w:history="1">
+      <w:hyperlink w:anchor="_Toc242904937" w:history="1">
         <w:r>
           <w:rPr>
             <w:rStyle w:val="Hyperlink"/>
@@ -949,7 +949,7 @@
             <w:noProof/>
             <w:webHidden/>
           </w:rPr>
-          <w:instrText xml:space="preserve"> PAGEREF _Toc242904389 \h </w:instrText>
+          <w:instrText xml:space="preserve"> PAGEREF _Toc242904937 \h </w:instrText>
         </w:r>
         <w:r>
           <w:rPr>
@@ -996,7 +996,7 @@
           <w14:ligatures w14:val="standardContextual"/>
         </w:rPr>
       </w:pPr>
-      <w:hyperlink w:anchor="_Toc242904390" w:history="1">
+      <w:hyperlink w:anchor="_Toc242904938" w:history="1">
         <w:r>
           <w:rPr>
             <w:rStyle w:val="Hyperlink"/>
@@ -1023,7 +1023,7 @@
             <w:noProof/>
             <w:webHidden/>
           </w:rPr>
-          <w:instrText xml:space="preserve"> PAGEREF _Toc242904390 \h </w:instrText>
+          <w:instrText xml:space="preserve"> PAGEREF _Toc242904938 \h </w:instrText>
         </w:r>
         <w:r>
           <w:rPr>
@@ -1070,7 +1070,7 @@
           <w14:ligatures w14:val="standardContextual"/>
         </w:rPr>
       </w:pPr>
-      <w:hyperlink w:anchor="_Toc242904391" w:history="1">
+      <w:hyperlink w:anchor="_Toc242904939" w:history="1">
         <w:r>
           <w:rPr>
             <w:rStyle w:val="Hyperlink"/>
@@ -1097,7 +1097,7 @@
             <w:noProof/>
             <w:webHidden/>
           </w:rPr>
-          <w:instrText xml:space="preserve"> PAGEREF _Toc242904391 \h </w:instrText>
+          <w:instrText xml:space="preserve"> PAGEREF _Toc242904939 \h </w:instrText>
         </w:r>
         <w:r>
           <w:rPr>
@@ -1144,7 +1144,7 @@
           <w14:ligatures w14:val="standardContextual"/>
         </w:rPr>
       </w:pPr>
-      <w:hyperlink w:anchor="_Toc242904392" w:history="1">
+      <w:hyperlink w:anchor="_Toc242904940" w:history="1">
         <w:r>
           <w:rPr>
             <w:rStyle w:val="Hyperlink"/>
@@ -1171,7 +1171,7 @@
             <w:noProof/>
             <w:webHidden/>
           </w:rPr>
-          <w:instrText xml:space="preserve"> PAGEREF _Toc242904392 \h </w:instrText>
+          <w:instrText xml:space="preserve"> PAGEREF _Toc242904940 \h </w:instrText>
         </w:r>
         <w:r>
           <w:rPr>
@@ -1218,7 +1218,7 @@
           <w14:ligatures w14:val="standardContextual"/>
         </w:rPr>
       </w:pPr>
-      <w:hyperlink w:anchor="_Toc242904393" w:history="1">
+      <w:hyperlink w:anchor="_Toc242904941" w:history="1">
         <w:r>
           <w:rPr>
             <w:rStyle w:val="Hyperlink"/>
@@ -1245,7 +1245,7 @@
             <w:noProof/>
             <w:webHidden/>
           </w:rPr>
-          <w:instrText xml:space="preserve"> PAGEREF _Toc242904393 \h </w:instrText>
+          <w:instrText xml:space="preserve"> PAGEREF _Toc242904941 \h </w:instrText>
         </w:r>
         <w:r>
           <w:rPr>
@@ -1292,7 +1292,7 @@
           <w14:ligatures w14:val="standardContextual"/>
         </w:rPr>
       </w:pPr>
-      <w:hyperlink w:anchor="_Toc242904394" w:history="1">
+      <w:hyperlink w:anchor="_Toc242904942" w:history="1">
         <w:r>
           <w:rPr>
             <w:rStyle w:val="Hyperlink"/>
@@ -1319,7 +1319,7 @@
             <w:noProof/>
             <w:webHidden/>
           </w:rPr>
-          <w:instrText xml:space="preserve"> PAGEREF _Toc242904394 \h </w:instrText>
+          <w:instrText xml:space="preserve"> PAGEREF _Toc242904942 \h </w:instrText>
         </w:r>
         <w:r>
           <w:rPr>
@@ -1366,7 +1366,7 @@
           <w14:ligatures w14:val="standardContextual"/>
         </w:rPr>
       </w:pPr>
-      <w:hyperlink w:anchor="_Toc242904395" w:history="1">
+      <w:hyperlink w:anchor="_Toc242904943" w:history="1">
         <w:r>
           <w:rPr>
             <w:rStyle w:val="Hyperlink"/>
@@ -1393,7 +1393,7 @@
             <w:noProof/>
             <w:webHidden/>
           </w:rPr>
-          <w:instrText xml:space="preserve"> PAGEREF _Toc242904395 \h </w:instrText>
+          <w:instrText xml:space="preserve"> PAGEREF _Toc242904943 \h </w:instrText>
         </w:r>
         <w:r>
           <w:rPr>
@@ -1440,7 +1440,7 @@
           <w14:ligatures w14:val="standardContextual"/>
         </w:rPr>
       </w:pPr>
-      <w:hyperlink w:anchor="_Toc242904396" w:history="1">
+      <w:hyperlink w:anchor="_Toc242904944" w:history="1">
         <w:r>
           <w:rPr>
             <w:rStyle w:val="Hyperlink"/>
@@ -1467,7 +1467,7 @@
             <w:noProof/>
             <w:webHidden/>
           </w:rPr>
-          <w:instrText xml:space="preserve"> PAGEREF _Toc242904396 \h </w:instrText>
+          <w:instrText xml:space="preserve"> PAGEREF _Toc242904944 \h </w:instrText>
         </w:r>
         <w:r>
           <w:rPr>
@@ -1515,7 +1515,7 @@
           <w14:ligatures w14:val="standardContextual"/>
         </w:rPr>
       </w:pPr>
-      <w:hyperlink w:anchor="_Toc242904397" w:history="1">
+      <w:hyperlink w:anchor="_Toc242904945" w:history="1">
         <w:r>
           <w:rPr>
             <w:rStyle w:val="Hyperlink"/>
@@ -1542,7 +1542,7 @@
             <w:noProof/>
             <w:webHidden/>
           </w:rPr>
-          <w:instrText xml:space="preserve"> PAGEREF _Toc242904397 \h </w:instrText>
+          <w:instrText xml:space="preserve"> PAGEREF _Toc242904945 \h </w:instrText>
         </w:r>
         <w:r>
           <w:rPr>
@@ -1589,7 +1589,7 @@
           <w14:ligatures w14:val="standardContextual"/>
         </w:rPr>
       </w:pPr>
-      <w:hyperlink w:anchor="_Toc242904398" w:history="1">
+      <w:hyperlink w:anchor="_Toc242904946" w:history="1">
         <w:r>
           <w:rPr>
             <w:rStyle w:val="Hyperlink"/>
@@ -1616,7 +1616,7 @@
             <w:noProof/>
             <w:webHidden/>
           </w:rPr>
-          <w:instrText xml:space="preserve"> PAGEREF _Toc242904398 \h </w:instrText>
+          <w:instrText xml:space="preserve"> PAGEREF _Toc242904946 \h </w:instrText>
         </w:r>
         <w:r>
           <w:rPr>
@@ -1663,7 +1663,7 @@
           <w14:ligatures w14:val="standardContextual"/>
         </w:rPr>
       </w:pPr>
-      <w:hyperlink w:anchor="_Toc242904399" w:history="1">
+      <w:hyperlink w:anchor="_Toc242904947" w:history="1">
         <w:r>
           <w:rPr>
             <w:rStyle w:val="Hyperlink"/>
@@ -1690,7 +1690,7 @@
             <w:noProof/>
             <w:webHidden/>
           </w:rPr>
-          <w:instrText xml:space="preserve"> PAGEREF _Toc242904399 \h </w:instrText>
+          <w:instrText xml:space="preserve"> PAGEREF _Toc242904947 \h </w:instrText>
         </w:r>
         <w:r>
           <w:rPr>
@@ -1737,7 +1737,7 @@
           <w14:ligatures w14:val="standardContextual"/>
         </w:rPr>
       </w:pPr>
-      <w:hyperlink w:anchor="_Toc242904400" w:history="1">
+      <w:hyperlink w:anchor="_Toc242904948" w:history="1">
         <w:r>
           <w:rPr>
             <w:rStyle w:val="Hyperlink"/>
@@ -1764,7 +1764,7 @@
             <w:noProof/>
             <w:webHidden/>
           </w:rPr>
-          <w:instrText xml:space="preserve"> PAGEREF _Toc242904400 \h </w:instrText>
+          <w:instrText xml:space="preserve"> PAGEREF _Toc242904948 \h </w:instrText>
         </w:r>
         <w:r>
           <w:rPr>
@@ -1811,7 +1811,7 @@
           <w14:ligatures w14:val="standardContextual"/>
         </w:rPr>
       </w:pPr>
-      <w:hyperlink w:anchor="_Toc242904401" w:history="1">
+      <w:hyperlink w:anchor="_Toc242904949" w:history="1">
         <w:r>
           <w:rPr>
             <w:rStyle w:val="Hyperlink"/>
@@ -1838,7 +1838,7 @@
             <w:noProof/>
             <w:webHidden/>
           </w:rPr>
-          <w:instrText xml:space="preserve"> PAGEREF _Toc242904401 \h </w:instrText>
+          <w:instrText xml:space="preserve"> PAGEREF _Toc242904949 \h </w:instrText>
         </w:r>
         <w:r>
           <w:rPr>
@@ -1885,7 +1885,7 @@
           <w14:ligatures w14:val="standardContextual"/>
         </w:rPr>
       </w:pPr>
-      <w:hyperlink w:anchor="_Toc242904402" w:history="1">
+      <w:hyperlink w:anchor="_Toc242904950" w:history="1">
         <w:r>
           <w:rPr>
             <w:rStyle w:val="Hyperlink"/>
@@ -1912,7 +1912,7 @@
             <w:noProof/>
             <w:webHidden/>
           </w:rPr>
-          <w:instrText xml:space="preserve"> PAGEREF _Toc242904402 \h </w:instrText>
+          <w:instrText xml:space="preserve"> PAGEREF _Toc242904950 \h </w:instrText>
         </w:r>
         <w:r>
           <w:rPr>
@@ -1959,7 +1959,7 @@
           <w14:ligatures w14:val="standardContextual"/>
         </w:rPr>
       </w:pPr>
-      <w:hyperlink w:anchor="_Toc242904403" w:history="1">
+      <w:hyperlink w:anchor="_Toc242904951" w:history="1">
         <w:r>
           <w:rPr>
             <w:rStyle w:val="Hyperlink"/>
@@ -1986,7 +1986,7 @@
             <w:noProof/>
             <w:webHidden/>
           </w:rPr>
-          <w:instrText xml:space="preserve"> PAGEREF _Toc242904403 \h </w:instrText>
+          <w:instrText xml:space="preserve"> PAGEREF _Toc242904951 \h </w:instrText>
         </w:r>
         <w:r>
           <w:rPr>
@@ -2033,7 +2033,7 @@
           <w14:ligatures w14:val="standardContextual"/>
         </w:rPr>
       </w:pPr>
-      <w:hyperlink w:anchor="_Toc242904404" w:history="1">
+      <w:hyperlink w:anchor="_Toc242904952" w:history="1">
         <w:r>
           <w:rPr>
             <w:rStyle w:val="Hyperlink"/>
@@ -2060,7 +2060,7 @@
             <w:noProof/>
             <w:webHidden/>
           </w:rPr>
-          <w:instrText xml:space="preserve"> PAGEREF _Toc242904404 \h </w:instrText>
+          <w:instrText xml:space="preserve"> PAGEREF _Toc242904952 \h </w:instrText>
         </w:r>
         <w:r>
           <w:rPr>
@@ -2107,7 +2107,7 @@
           <w14:ligatures w14:val="standardContextual"/>
         </w:rPr>
       </w:pPr>
-      <w:hyperlink w:anchor="_Toc242904405" w:history="1">
+      <w:hyperlink w:anchor="_Toc242904953" w:history="1">
         <w:r>
           <w:rPr>
             <w:rStyle w:val="Hyperlink"/>
@@ -2134,7 +2134,7 @@
             <w:noProof/>
             <w:webHidden/>
           </w:rPr>
-          <w:instrText xml:space="preserve"> PAGEREF _Toc242904405 \h </w:instrText>
+          <w:instrText xml:space="preserve"> PAGEREF _Toc242904953 \h </w:instrText>
         </w:r>
         <w:r>
           <w:rPr>
@@ -2181,7 +2181,7 @@
           <w14:ligatures w14:val="standardContextual"/>
         </w:rPr>
       </w:pPr>
-      <w:hyperlink w:anchor="_Toc242904406" w:history="1">
+      <w:hyperlink w:anchor="_Toc242904954" w:history="1">
         <w:r>
           <w:rPr>
             <w:rStyle w:val="Hyperlink"/>
@@ -2208,7 +2208,7 @@
             <w:noProof/>
             <w:webHidden/>
           </w:rPr>
-          <w:instrText xml:space="preserve"> PAGEREF _Toc242904406 \h </w:instrText>
+          <w:instrText xml:space="preserve"> PAGEREF _Toc242904954 \h </w:instrText>
         </w:r>
         <w:r>
           <w:rPr>
@@ -2255,7 +2255,7 @@
           <w14:ligatures w14:val="standardContextual"/>
         </w:rPr>
       </w:pPr>
-      <w:hyperlink w:anchor="_Toc242904407" w:history="1">
+      <w:hyperlink w:anchor="_Toc242904955" w:history="1">
         <w:r>
           <w:rPr>
             <w:rStyle w:val="Hyperlink"/>
@@ -2282,7 +2282,7 @@
             <w:noProof/>
             <w:webHidden/>
           </w:rPr>
-          <w:instrText xml:space="preserve"> PAGEREF _Toc242904407 \h </w:instrText>
+          <w:instrText xml:space="preserve"> PAGEREF _Toc242904955 \h </w:instrText>
         </w:r>
         <w:r>
           <w:rPr>
@@ -2329,7 +2329,7 @@
           <w14:ligatures w14:val="standardContextual"/>
         </w:rPr>
       </w:pPr>
-      <w:hyperlink w:anchor="_Toc242904408" w:history="1">
+      <w:hyperlink w:anchor="_Toc242904956" w:history="1">
         <w:r>
           <w:rPr>
             <w:rStyle w:val="Hyperlink"/>
@@ -2356,7 +2356,7 @@
             <w:noProof/>
             <w:webHidden/>
           </w:rPr>
-          <w:instrText xml:space="preserve"> PAGEREF _Toc242904408 \h </w:instrText>
+          <w:instrText xml:space="preserve"> PAGEREF _Toc242904956 \h </w:instrText>
         </w:r>
         <w:r>
           <w:rPr>
@@ -2403,7 +2403,7 @@
           <w14:ligatures w14:val="standardContextual"/>
         </w:rPr>
       </w:pPr>
-      <w:hyperlink w:anchor="_Toc242904409" w:history="1">
+      <w:hyperlink w:anchor="_Toc242904957" w:history="1">
         <w:r>
           <w:rPr>
             <w:rStyle w:val="Hyperlink"/>
@@ -2430,7 +2430,7 @@
             <w:noProof/>
             <w:webHidden/>
           </w:rPr>
-          <w:instrText xml:space="preserve"> PAGEREF _Toc242904409 \h </w:instrText>
+          <w:instrText xml:space="preserve"> PAGEREF _Toc242904957 \h </w:instrText>
         </w:r>
         <w:r>
           <w:rPr>
@@ -2478,7 +2478,7 @@
           <w14:ligatures w14:val="standardContextual"/>
         </w:rPr>
       </w:pPr>
-      <w:hyperlink w:anchor="_Toc242904410" w:history="1">
+      <w:hyperlink w:anchor="_Toc242904958" w:history="1">
         <w:r>
           <w:rPr>
             <w:rStyle w:val="Hyperlink"/>
@@ -2505,7 +2505,7 @@
             <w:noProof/>
             <w:webHidden/>
           </w:rPr>
-          <w:instrText xml:space="preserve"> PAGEREF _Toc242904410 \h </w:instrText>
+          <w:instrText xml:space="preserve"> PAGEREF _Toc242904958 \h </w:instrText>
         </w:r>
         <w:r>
           <w:rPr>
@@ -2552,7 +2552,7 @@
           <w14:ligatures w14:val="standardContextual"/>
         </w:rPr>
       </w:pPr>
-      <w:hyperlink w:anchor="_Toc242904411" w:history="1">
+      <w:hyperlink w:anchor="_Toc242904959" w:history="1">
         <w:r>
           <w:rPr>
             <w:rStyle w:val="Hyperlink"/>
@@ -2579,7 +2579,7 @@
             <w:noProof/>
             <w:webHidden/>
           </w:rPr>
-          <w:instrText xml:space="preserve"> PAGEREF _Toc242904411 \h </w:instrText>
+          <w:instrText xml:space="preserve"> PAGEREF _Toc242904959 \h </w:instrText>
         </w:r>
         <w:r>
           <w:rPr>
@@ -2626,7 +2626,7 @@
           <w14:ligatures w14:val="standardContextual"/>
         </w:rPr>
       </w:pPr>
-      <w:hyperlink w:anchor="_Toc242904412" w:history="1">
+      <w:hyperlink w:anchor="_Toc242904960" w:history="1">
         <w:r>
           <w:rPr>
             <w:rStyle w:val="Hyperlink"/>
@@ -2653,7 +2653,7 @@
             <w:noProof/>
             <w:webHidden/>
           </w:rPr>
-          <w:instrText xml:space="preserve"> PAGEREF _Toc242904412 \h </w:instrText>
+          <w:instrText xml:space="preserve"> PAGEREF _Toc242904960 \h </w:instrText>
         </w:r>
         <w:r>
           <w:rPr>
@@ -2700,7 +2700,7 @@
           <w14:ligatures w14:val="standardContextual"/>
         </w:rPr>
       </w:pPr>
-      <w:hyperlink w:anchor="_Toc242904413" w:history="1">
+      <w:hyperlink w:anchor="_Toc242904961" w:history="1">
         <w:r>
           <w:rPr>
             <w:rStyle w:val="Hyperlink"/>
@@ -2727,7 +2727,7 @@
             <w:noProof/>
             <w:webHidden/>
           </w:rPr>
-          <w:instrText xml:space="preserve"> PAGEREF _Toc242904413 \h </w:instrText>
+          <w:instrText xml:space="preserve"> PAGEREF _Toc242904961 \h </w:instrText>
         </w:r>
         <w:r>
           <w:rPr>
@@ -2775,7 +2775,7 @@
           <w14:ligatures w14:val="standardContextual"/>
         </w:rPr>
       </w:pPr>
-      <w:hyperlink w:anchor="_Toc242904414" w:history="1">
+      <w:hyperlink w:anchor="_Toc242904962" w:history="1">
         <w:r>
           <w:rPr>
             <w:rStyle w:val="Hyperlink"/>
@@ -2802,7 +2802,7 @@
             <w:noProof/>
             <w:webHidden/>
           </w:rPr>
-          <w:instrText xml:space="preserve"> PAGEREF _Toc242904414 \h </w:instrText>
+          <w:instrText xml:space="preserve"> PAGEREF _Toc242904962 \h </w:instrText>
         </w:r>
         <w:r>
           <w:rPr>
@@ -2849,7 +2849,7 @@
           <w14:ligatures w14:val="standardContextual"/>
         </w:rPr>
       </w:pPr>
-      <w:hyperlink w:anchor="_Toc242904415" w:history="1">
+      <w:hyperlink w:anchor="_Toc242904963" w:history="1">
         <w:r>
           <w:rPr>
             <w:rStyle w:val="Hyperlink"/>
@@ -2876,7 +2876,7 @@
             <w:noProof/>
             <w:webHidden/>
           </w:rPr>
-          <w:instrText xml:space="preserve"> PAGEREF _Toc242904415 \h </w:instrText>
+          <w:instrText xml:space="preserve"> PAGEREF _Toc242904963 \h </w:instrText>
         </w:r>
         <w:r>
           <w:rPr>
@@ -2923,7 +2923,7 @@
           <w14:ligatures w14:val="standardContextual"/>
         </w:rPr>
       </w:pPr>
-      <w:hyperlink w:anchor="_Toc242904416" w:history="1">
+      <w:hyperlink w:anchor="_Toc242904964" w:history="1">
         <w:r>
           <w:rPr>
             <w:rStyle w:val="Hyperlink"/>
@@ -2950,7 +2950,7 @@
             <w:noProof/>
             <w:webHidden/>
           </w:rPr>
-          <w:instrText xml:space="preserve"> PAGEREF _Toc242904416 \h </w:instrText>
+          <w:instrText xml:space="preserve"> PAGEREF _Toc242904964 \h </w:instrText>
         </w:r>
         <w:r>
           <w:rPr>
@@ -2997,7 +2997,7 @@
           <w14:ligatures w14:val="standardContextual"/>
         </w:rPr>
       </w:pPr>
-      <w:hyperlink w:anchor="_Toc242904417" w:history="1">
+      <w:hyperlink w:anchor="_Toc242904965" w:history="1">
         <w:r>
           <w:rPr>
             <w:rStyle w:val="Hyperlink"/>
@@ -3024,7 +3024,7 @@
             <w:noProof/>
             <w:webHidden/>
           </w:rPr>
-          <w:instrText xml:space="preserve"> PAGEREF _Toc242904417 \h </w:instrText>
+          <w:instrText xml:space="preserve"> PAGEREF _Toc242904965 \h </w:instrText>
         </w:r>
         <w:r>
           <w:rPr>
@@ -3071,7 +3071,7 @@
           <w14:ligatures w14:val="standardContextual"/>
         </w:rPr>
       </w:pPr>
-      <w:hyperlink w:anchor="_Toc242904418" w:history="1">
+      <w:hyperlink w:anchor="_Toc242904966" w:history="1">
         <w:r>
           <w:rPr>
             <w:rStyle w:val="Hyperlink"/>
@@ -3098,7 +3098,7 @@
             <w:noProof/>
             <w:webHidden/>
           </w:rPr>
-          <w:instrText xml:space="preserve"> PAGEREF _Toc242904418 \h </w:instrText>
+          <w:instrText xml:space="preserve"> PAGEREF _Toc242904966 \h </w:instrText>
         </w:r>
         <w:r>
           <w:rPr>
@@ -3146,7 +3146,7 @@
           <w14:ligatures w14:val="standardContextual"/>
         </w:rPr>
       </w:pPr>
-      <w:hyperlink w:anchor="_Toc242904419" w:history="1">
+      <w:hyperlink w:anchor="_Toc242904967" w:history="1">
         <w:r>
           <w:rPr>
             <w:rStyle w:val="Hyperlink"/>
@@ -3173,7 +3173,7 @@
             <w:noProof/>
             <w:webHidden/>
           </w:rPr>
-          <w:instrText xml:space="preserve"> PAGEREF _Toc242904419 \h </w:instrText>
+          <w:instrText xml:space="preserve"> PAGEREF _Toc242904967 \h </w:instrText>
         </w:r>
         <w:r>
           <w:rPr>
@@ -3220,7 +3220,7 @@
           <w14:ligatures w14:val="standardContextual"/>
         </w:rPr>
       </w:pPr>
-      <w:hyperlink w:anchor="_Toc242904420" w:history="1">
+      <w:hyperlink w:anchor="_Toc242904968" w:history="1">
         <w:r>
           <w:rPr>
             <w:rStyle w:val="Hyperlink"/>
@@ -3247,7 +3247,7 @@
             <w:noProof/>
             <w:webHidden/>
           </w:rPr>
-          <w:instrText xml:space="preserve"> PAGEREF _Toc242904420 \h </w:instrText>
+          <w:instrText xml:space="preserve"> PAGEREF _Toc242904968 \h </w:instrText>
         </w:r>
         <w:r>
           <w:rPr>
@@ -3294,7 +3294,7 @@
           <w14:ligatures w14:val="standardContextual"/>
         </w:rPr>
       </w:pPr>
-      <w:hyperlink w:anchor="_Toc242904421" w:history="1">
+      <w:hyperlink w:anchor="_Toc242904969" w:history="1">
         <w:r>
           <w:rPr>
             <w:rStyle w:val="Hyperlink"/>
@@ -3321,7 +3321,7 @@
             <w:noProof/>
             <w:webHidden/>
           </w:rPr>
-          <w:instrText xml:space="preserve"> PAGEREF _Toc242904421 \h </w:instrText>
+          <w:instrText xml:space="preserve"> PAGEREF _Toc242904969 \h </w:instrText>
         </w:r>
         <w:r>
           <w:rPr>
@@ -3389,7 +3389,7 @@
       <w:bookmarkStart w:id="7" w:name="_Toc242875938"/>
       <w:bookmarkStart w:id="8" w:name="_Toc242876903"/>
       <w:bookmarkStart w:id="9" w:name="_Toc242877888"/>
-      <w:bookmarkStart w:id="10" w:name="_Toc242904384"/>
+      <w:bookmarkStart w:id="10" w:name="_Toc242904932"/>
       <w:r>
         <w:lastRenderedPageBreak/>
         <w:t>Chương 1 Phạm vi và hệ thống thực hành Tuần 2</w:t>
@@ -3420,7 +3420,7 @@
       <w:bookmarkStart w:id="18" w:name="_Toc242875939"/>
       <w:bookmarkStart w:id="19" w:name="_Toc242876904"/>
       <w:bookmarkStart w:id="20" w:name="_Toc242877889"/>
-      <w:bookmarkStart w:id="21" w:name="_Toc242904385"/>
+      <w:bookmarkStart w:id="21" w:name="_Toc242904933"/>
       <w:r>
         <w:t>1.1 Mục tiêu và phạm vi số liệu</w:t>
       </w:r>
@@ -3468,7 +3468,7 @@
       <w:bookmarkStart w:id="29" w:name="_Toc242875940"/>
       <w:bookmarkStart w:id="30" w:name="_Toc242876905"/>
       <w:bookmarkStart w:id="31" w:name="_Toc242877890"/>
-      <w:bookmarkStart w:id="32" w:name="_Toc242904386"/>
+      <w:bookmarkStart w:id="32" w:name="_Toc242904934"/>
       <w:r>
         <w:t>1.2 Phân công và thời gian thực hiện</w:t>
       </w:r>
@@ -3800,7 +3800,7 @@
       <w:bookmarkStart w:id="40" w:name="_Toc242875941"/>
       <w:bookmarkStart w:id="41" w:name="_Toc242876906"/>
       <w:bookmarkStart w:id="42" w:name="_Toc242877891"/>
-      <w:bookmarkStart w:id="43" w:name="_Toc242904387"/>
+      <w:bookmarkStart w:id="43" w:name="_Toc242904935"/>
       <w:r>
         <w:lastRenderedPageBreak/>
         <w:t>1.3 Kiến trúc và luồng xử lý</w:t>
@@ -3898,7 +3898,7 @@
       <w:bookmarkStart w:id="51" w:name="_Toc242875942"/>
       <w:bookmarkStart w:id="52" w:name="_Toc242876907"/>
       <w:bookmarkStart w:id="53" w:name="_Toc242877892"/>
-      <w:bookmarkStart w:id="54" w:name="_Toc242904388"/>
+      <w:bookmarkStart w:id="54" w:name="_Toc242904936"/>
       <w:r>
         <w:lastRenderedPageBreak/>
         <w:t>1.4 Trạng thái dịch vụ trong dữ liệu Tuần 2</w:t>
@@ -4351,7 +4351,7 @@
       <w:bookmarkStart w:id="62" w:name="_Toc242875943"/>
       <w:bookmarkStart w:id="63" w:name="_Toc242876908"/>
       <w:bookmarkStart w:id="64" w:name="_Toc242877893"/>
-      <w:bookmarkStart w:id="65" w:name="_Toc242904389"/>
+      <w:bookmarkStart w:id="65" w:name="_Toc242904937"/>
       <w:r>
         <w:lastRenderedPageBreak/>
         <w:t>Chương 2 Nguồn dữ liệu và phương pháp phân tích</w:t>
@@ -4382,7 +4382,7 @@
       <w:bookmarkStart w:id="73" w:name="_Toc242875944"/>
       <w:bookmarkStart w:id="74" w:name="_Toc242876909"/>
       <w:bookmarkStart w:id="75" w:name="_Toc242877894"/>
-      <w:bookmarkStart w:id="76" w:name="_Toc242904390"/>
+      <w:bookmarkStart w:id="76" w:name="_Toc242904938"/>
       <w:r>
         <w:t>2.1 Toàn bộ dữ liệu và mẫu thuộc Tuần 2</w:t>
       </w:r>
@@ -4883,7 +4883,7 @@
       <w:bookmarkStart w:id="84" w:name="_Toc242875945"/>
       <w:bookmarkStart w:id="85" w:name="_Toc242876910"/>
       <w:bookmarkStart w:id="86" w:name="_Toc242877895"/>
-      <w:bookmarkStart w:id="87" w:name="_Toc242904391"/>
+      <w:bookmarkStart w:id="87" w:name="_Toc242904939"/>
       <w:r>
         <w:lastRenderedPageBreak/>
         <w:t>2.2 Cấu trúc và chất lượng bản ghi</w:t>
@@ -5264,7 +5264,7 @@
       <w:bookmarkStart w:id="90" w:name="_Toc242875946"/>
       <w:bookmarkStart w:id="91" w:name="_Toc242876911"/>
       <w:bookmarkStart w:id="92" w:name="_Toc242877896"/>
-      <w:bookmarkStart w:id="93" w:name="_Toc242904392"/>
+      <w:bookmarkStart w:id="93" w:name="_Toc242904940"/>
       <w:r>
         <w:t>2.3 Hai bộ báo cáo dữ liệu của nhóm</w:t>
       </w:r>
@@ -5307,7 +5307,7 @@
       <w:bookmarkStart w:id="101" w:name="_Toc242875947"/>
       <w:bookmarkStart w:id="102" w:name="_Toc242876912"/>
       <w:bookmarkStart w:id="103" w:name="_Toc242877897"/>
-      <w:bookmarkStart w:id="104" w:name="_Toc242904393"/>
+      <w:bookmarkStart w:id="104" w:name="_Toc242904941"/>
       <w:r>
         <w:lastRenderedPageBreak/>
         <w:t>2.4 Các đại lượng và cách diễn giải</w:t>
@@ -5674,7 +5674,7 @@
       <w:bookmarkStart w:id="112" w:name="_Toc242875948"/>
       <w:bookmarkStart w:id="113" w:name="_Toc242876913"/>
       <w:bookmarkStart w:id="114" w:name="_Toc242877898"/>
-      <w:bookmarkStart w:id="115" w:name="_Toc242904394"/>
+      <w:bookmarkStart w:id="115" w:name="_Toc242904942"/>
       <w:r>
         <w:lastRenderedPageBreak/>
         <w:t>2.5 Thiết kế chức năng thu thập bằng Lambda</w:t>
@@ -6140,7 +6140,7 @@
       <w:bookmarkStart w:id="123" w:name="_Toc242875949"/>
       <w:bookmarkStart w:id="124" w:name="_Toc242876914"/>
       <w:bookmarkStart w:id="125" w:name="_Toc242877899"/>
-      <w:bookmarkStart w:id="126" w:name="_Toc242904395"/>
+      <w:bookmarkStart w:id="126" w:name="_Toc242904943"/>
       <w:r>
         <w:lastRenderedPageBreak/>
         <w:t>2.6 Lược đồ bản ghi và truy vấn dữ liệu</w:t>
@@ -8093,7 +8093,7 @@
       <w:bookmarkStart w:id="134" w:name="_Toc242875950"/>
       <w:bookmarkStart w:id="135" w:name="_Toc242876915"/>
       <w:bookmarkStart w:id="136" w:name="_Toc242877900"/>
-      <w:bookmarkStart w:id="137" w:name="_Toc242904396"/>
+      <w:bookmarkStart w:id="137" w:name="_Toc242904944"/>
       <w:r>
         <w:lastRenderedPageBreak/>
         <w:t>2.7 Quyền kích hoạt và điều kiện gửi thông báo</w:t>
@@ -8144,7 +8144,7 @@
       <w:bookmarkStart w:id="145" w:name="_Toc242875951"/>
       <w:bookmarkStart w:id="146" w:name="_Toc242876916"/>
       <w:bookmarkStart w:id="147" w:name="_Toc242877901"/>
-      <w:bookmarkStart w:id="148" w:name="_Toc242904397"/>
+      <w:bookmarkStart w:id="148" w:name="_Toc242904945"/>
       <w:r>
         <w:lastRenderedPageBreak/>
         <w:t>Chương 3 Phân tích dữ liệu môi trường Tuần 2</w:t>
@@ -8175,7 +8175,7 @@
       <w:bookmarkStart w:id="156" w:name="_Toc242875952"/>
       <w:bookmarkStart w:id="157" w:name="_Toc242876917"/>
       <w:bookmarkStart w:id="158" w:name="_Toc242877902"/>
-      <w:bookmarkStart w:id="159" w:name="_Toc242904398"/>
+      <w:bookmarkStart w:id="159" w:name="_Toc242904946"/>
       <w:r>
         <w:t>3.1 So sánh AQI theo đô thị</w:t>
       </w:r>
@@ -9282,7 +9282,7 @@
       <w:bookmarkStart w:id="167" w:name="_Toc242875953"/>
       <w:bookmarkStart w:id="168" w:name="_Toc242876918"/>
       <w:bookmarkStart w:id="169" w:name="_Toc242877903"/>
-      <w:bookmarkStart w:id="170" w:name="_Toc242904399"/>
+      <w:bookmarkStart w:id="170" w:name="_Toc242904947"/>
       <w:r>
         <w:lastRenderedPageBreak/>
         <w:t>3.2 Nồng độ PM2.5 và PM10</w:t>
@@ -10255,7 +10255,7 @@
       <w:bookmarkStart w:id="178" w:name="_Toc242875954"/>
       <w:bookmarkStart w:id="179" w:name="_Toc242876919"/>
       <w:bookmarkStart w:id="180" w:name="_Toc242877904"/>
-      <w:bookmarkStart w:id="181" w:name="_Toc242904400"/>
+      <w:bookmarkStart w:id="181" w:name="_Toc242904948"/>
       <w:r>
         <w:lastRenderedPageBreak/>
         <w:t>3.3 Trung vị tứ phân vị và P95</w:t>
@@ -11363,7 +11363,7 @@
       <w:bookmarkStart w:id="189" w:name="_Toc242875955"/>
       <w:bookmarkStart w:id="190" w:name="_Toc242876920"/>
       <w:bookmarkStart w:id="191" w:name="_Toc242877905"/>
-      <w:bookmarkStart w:id="192" w:name="_Toc242904401"/>
+      <w:bookmarkStart w:id="192" w:name="_Toc242904949"/>
       <w:r>
         <w:lastRenderedPageBreak/>
         <w:t>3.4 Diễn biến tại các giờ có quan trắc</w:t>
@@ -12212,7 +12212,7 @@
       <w:bookmarkStart w:id="200" w:name="_Toc242875956"/>
       <w:bookmarkStart w:id="201" w:name="_Toc242876921"/>
       <w:bookmarkStart w:id="202" w:name="_Toc242877906"/>
-      <w:bookmarkStart w:id="203" w:name="_Toc242904402"/>
+      <w:bookmarkStart w:id="203" w:name="_Toc242904950"/>
       <w:r>
         <w:lastRenderedPageBreak/>
         <w:t>3.5 Độ phủ và mật độ lấy mẫu</w:t>
@@ -12319,7 +12319,7 @@
       <w:bookmarkStart w:id="211" w:name="_Toc242875957"/>
       <w:bookmarkStart w:id="212" w:name="_Toc242876922"/>
       <w:bookmarkStart w:id="213" w:name="_Toc242877907"/>
-      <w:bookmarkStart w:id="214" w:name="_Toc242904403"/>
+      <w:bookmarkStart w:id="214" w:name="_Toc242904951"/>
       <w:r>
         <w:lastRenderedPageBreak/>
         <w:t>3.6 Phân bố các cấp chất lượng không khí</w:t>
@@ -13157,7 +13157,7 @@
       <w:bookmarkStart w:id="222" w:name="_Toc242875958"/>
       <w:bookmarkStart w:id="223" w:name="_Toc242876923"/>
       <w:bookmarkStart w:id="224" w:name="_Toc242877908"/>
-      <w:bookmarkStart w:id="225" w:name="_Toc242904404"/>
+      <w:bookmarkStart w:id="225" w:name="_Toc242904952"/>
       <w:r>
         <w:lastRenderedPageBreak/>
         <w:t>3.7 Tần suất vượt ngưỡng cấu hình cảnh báo</w:t>
@@ -14000,7 +14000,7 @@
       <w:bookmarkStart w:id="228" w:name="_Toc242875959"/>
       <w:bookmarkStart w:id="229" w:name="_Toc242876924"/>
       <w:bookmarkStart w:id="230" w:name="_Toc242877909"/>
-      <w:bookmarkStart w:id="231" w:name="_Toc242904405"/>
+      <w:bookmarkStart w:id="231" w:name="_Toc242904953"/>
       <w:r>
         <w:lastRenderedPageBreak/>
         <w:t>3.8 Đối chiếu hai báo cáo dữ liệu theo đô thị và giờ</w:t>
@@ -14649,7 +14649,7 @@
       <w:bookmarkStart w:id="239" w:name="_Toc242875960"/>
       <w:bookmarkStart w:id="240" w:name="_Toc242876925"/>
       <w:bookmarkStart w:id="241" w:name="_Toc242877910"/>
-      <w:bookmarkStart w:id="242" w:name="_Toc242904406"/>
+      <w:bookmarkStart w:id="242" w:name="_Toc242904954"/>
       <w:r>
         <w:lastRenderedPageBreak/>
         <w:t>3.9 Tương quan Pearson và Spearman</w:t>
@@ -15631,7 +15631,7 @@
       <w:bookmarkStart w:id="250" w:name="_Toc242875961"/>
       <w:bookmarkStart w:id="251" w:name="_Toc242876926"/>
       <w:bookmarkStart w:id="252" w:name="_Toc242877911"/>
-      <w:bookmarkStart w:id="253" w:name="_Toc242904407"/>
+      <w:bookmarkStart w:id="253" w:name="_Toc242904955"/>
       <w:r>
         <w:lastRenderedPageBreak/>
         <w:t>3.10 Quan sát trực tiếp quan hệ nhiệt độ và PM2.5</w:t>
@@ -15738,7 +15738,7 @@
       <w:bookmarkStart w:id="261" w:name="_Toc242875962"/>
       <w:bookmarkStart w:id="262" w:name="_Toc242876927"/>
       <w:bookmarkStart w:id="263" w:name="_Toc242877912"/>
-      <w:bookmarkStart w:id="264" w:name="_Toc242904408"/>
+      <w:bookmarkStart w:id="264" w:name="_Toc242904956"/>
       <w:r>
         <w:lastRenderedPageBreak/>
         <w:t>3.11 Các khí ô nhiễm còn lại</w:t>
@@ -16708,7 +16708,7 @@
       <w:bookmarkStart w:id="269" w:name="_Toc242875963"/>
       <w:bookmarkStart w:id="270" w:name="_Toc242876928"/>
       <w:bookmarkStart w:id="271" w:name="_Toc242877913"/>
-      <w:bookmarkStart w:id="272" w:name="_Toc242904409"/>
+      <w:bookmarkStart w:id="272" w:name="_Toc242904957"/>
       <w:r>
         <w:lastRenderedPageBreak/>
         <w:t>3.12 Đối chiếu với báo cáo Tuần 1</w:t>
@@ -19048,7 +19048,7 @@
       <w:bookmarkStart w:id="280" w:name="_Toc242875964"/>
       <w:bookmarkStart w:id="281" w:name="_Toc242876929"/>
       <w:bookmarkStart w:id="282" w:name="_Toc242877914"/>
-      <w:bookmarkStart w:id="283" w:name="_Toc242904410"/>
+      <w:bookmarkStart w:id="283" w:name="_Toc242904958"/>
       <w:r>
         <w:lastRenderedPageBreak/>
         <w:t>Chương 4 Phân tích vận hành Lambda và SNS</w:t>
@@ -19079,7 +19079,7 @@
       <w:bookmarkStart w:id="291" w:name="_Toc242875965"/>
       <w:bookmarkStart w:id="292" w:name="_Toc242876930"/>
       <w:bookmarkStart w:id="293" w:name="_Toc242877915"/>
-      <w:bookmarkStart w:id="294" w:name="_Toc242904411"/>
+      <w:bookmarkStart w:id="294" w:name="_Toc242904959"/>
       <w:r>
         <w:t>4.1 Thời gian thực thi và bộ nhớ Lambda</w:t>
       </w:r>
@@ -19580,7 +19580,7 @@
       <w:bookmarkStart w:id="302" w:name="_Toc242875966"/>
       <w:bookmarkStart w:id="303" w:name="_Toc242876931"/>
       <w:bookmarkStart w:id="304" w:name="_Toc242877916"/>
-      <w:bookmarkStart w:id="305" w:name="_Toc242904412"/>
+      <w:bookmarkStart w:id="305" w:name="_Toc242904960"/>
       <w:r>
         <w:lastRenderedPageBreak/>
         <w:t>4.2 Lịch thu thập và thông báo SNS</w:t>
@@ -19966,7 +19966,7 @@
       <w:bookmarkStart w:id="313" w:name="_Toc242875967"/>
       <w:bookmarkStart w:id="314" w:name="_Toc242876932"/>
       <w:bookmarkStart w:id="315" w:name="_Toc242877917"/>
-      <w:bookmarkStart w:id="316" w:name="_Toc242904413"/>
+      <w:bookmarkStart w:id="316" w:name="_Toc242904961"/>
       <w:r>
         <w:t>4.3 Đối chiếu sự nhất quán của chỉ số vận hành</w:t>
       </w:r>
@@ -20353,7 +20353,7 @@
       <w:bookmarkStart w:id="324" w:name="_Toc242875968"/>
       <w:bookmarkStart w:id="325" w:name="_Toc242876933"/>
       <w:bookmarkStart w:id="326" w:name="_Toc242877918"/>
-      <w:bookmarkStart w:id="327" w:name="_Toc242904414"/>
+      <w:bookmarkStart w:id="327" w:name="_Toc242904962"/>
       <w:r>
         <w:lastRenderedPageBreak/>
         <w:t>Chương 5 Phân tích truy vấn và sử dụng tài nguyên</w:t>
@@ -20384,7 +20384,7 @@
       <w:bookmarkStart w:id="335" w:name="_Toc242875969"/>
       <w:bookmarkStart w:id="336" w:name="_Toc242876934"/>
       <w:bookmarkStart w:id="337" w:name="_Toc242877919"/>
-      <w:bookmarkStart w:id="338" w:name="_Toc242904415"/>
+      <w:bookmarkStart w:id="338" w:name="_Toc242904963"/>
       <w:r>
         <w:t>5.1 Đối chứng hiệu quả lọc phân vùng</w:t>
       </w:r>
@@ -20826,7 +20826,7 @@
       <w:bookmarkStart w:id="346" w:name="_Toc242875970"/>
       <w:bookmarkStart w:id="347" w:name="_Toc242876935"/>
       <w:bookmarkStart w:id="348" w:name="_Toc242877920"/>
-      <w:bookmarkStart w:id="349" w:name="_Toc242904416"/>
+      <w:bookmarkStart w:id="349" w:name="_Toc242904964"/>
       <w:r>
         <w:lastRenderedPageBreak/>
         <w:t>5.2 Hai mươi bốn truy vấn phân tích mới</w:t>
@@ -22215,7 +22215,7 @@
       <w:bookmarkStart w:id="357" w:name="_Toc242875971"/>
       <w:bookmarkStart w:id="358" w:name="_Toc242876936"/>
       <w:bookmarkStart w:id="359" w:name="_Toc242877921"/>
-      <w:bookmarkStart w:id="360" w:name="_Toc242904417"/>
+      <w:bookmarkStart w:id="360" w:name="_Toc242904965"/>
       <w:r>
         <w:t>5.3 Lịch sử truy vấn và phạm vi lỗi</w:t>
       </w:r>
@@ -22533,7 +22533,7 @@
       <w:bookmarkStart w:id="368" w:name="_Toc242875972"/>
       <w:bookmarkStart w:id="369" w:name="_Toc242876937"/>
       <w:bookmarkStart w:id="370" w:name="_Toc242877922"/>
-      <w:bookmarkStart w:id="371" w:name="_Toc242904418"/>
+      <w:bookmarkStart w:id="371" w:name="_Toc242904966"/>
       <w:r>
         <w:lastRenderedPageBreak/>
         <w:t>5.4 Chi phí từ Cost Explorer</w:t>
@@ -22843,6 +22843,15 @@
         <w:ind w:firstLine="504"/>
       </w:pPr>
       <w:r>
+        <w:t>Chi phí dự kiến: 0,05 USD cho phần thực hành của sinh viên Tiến Sơn trong Tuần 2. Đây là mức dự kiến do nhóm đề xuất; số liệu ghi nhận từ Cost Explorer được trình bày riêng trong Bảng 5.4.</w:t>
+      </w:r>
+    </w:p>
+    <w:p>
+      <w:pPr>
+        <w:pStyle w:val="BodyText"/>
+        <w:ind w:firstLine="504"/>
+      </w:pPr>
+      <w:r>
         <w:t>Cả hai kết quả đều có cờ Estimated. Đây là số liệu ước tính tại thời điểm trích xuất Cost Explorer, được tổng hợp theo dịch vụ và ngày trong môi trường AWS của từng sinh viên; chưa phải hóa đơn cuối cùng hoặc chi phí riêng của dự án được phân bổ bằng tag. Các tệp CSV lưu nguyên giá trị trước khi làm tròn, đơn vị và trạng thái ước tính để đối chiếu.</w:t>
       </w:r>
     </w:p>
@@ -22862,7 +22871,7 @@
       <w:bookmarkStart w:id="379" w:name="_Toc242875973"/>
       <w:bookmarkStart w:id="380" w:name="_Toc242876938"/>
       <w:bookmarkStart w:id="381" w:name="_Toc242877923"/>
-      <w:bookmarkStart w:id="382" w:name="_Toc242904419"/>
+      <w:bookmarkStart w:id="382" w:name="_Toc242904967"/>
       <w:r>
         <w:lastRenderedPageBreak/>
         <w:t>Chương 6 Tổng hợp kết quả Tuần 2</w:t>
@@ -22893,7 +22902,7 @@
       <w:bookmarkStart w:id="390" w:name="_Toc242875974"/>
       <w:bookmarkStart w:id="391" w:name="_Toc242876939"/>
       <w:bookmarkStart w:id="392" w:name="_Toc242877924"/>
-      <w:bookmarkStart w:id="393" w:name="_Toc242904420"/>
+      <w:bookmarkStart w:id="393" w:name="_Toc242904968"/>
       <w:r>
         <w:t>6.1 Sản phẩm dữ liệu và phân tích</w:t>
       </w:r>
@@ -23257,7 +23266,7 @@
       <w:bookmarkStart w:id="401" w:name="_Toc242875975"/>
       <w:bookmarkStart w:id="402" w:name="_Toc242876940"/>
       <w:bookmarkStart w:id="403" w:name="_Toc242877925"/>
-      <w:bookmarkStart w:id="404" w:name="_Toc242904421"/>
+      <w:bookmarkStart w:id="404" w:name="_Toc242904969"/>
       <w:r>
         <w:t>6.2 Kết luận trong phạm vi mẫu đã thu thập</w:t>
       </w:r>

</xml_diff>